<commit_message>
docs: use current ZX-UX v1 C48 specification
</commit_message>
<xml_diff>
--- a/docs/04-C48 Language Specification Rev 0.11.docx
+++ b/docs/04-C48 Language Specification Rev 0.11.docx
@@ -105,8 +105,9 @@
       <w:pPr>
         <w:pStyle w:val="Heading2"/>
       </w:pPr>
-      <w:r>
-        <w:t>C48 Language Specification -- Rev 0.11 (Standalone Edition)</w:t>
+      <w:bookmarkStart w:id="1" w:name="Xc1deaaa9a97a82158f5158c1b7c62473caf2698"/>
+      <w:r>
+        <w:t>C48 Language Specification Rev 0.11 — ZX-UX v1 toolchain edition</w:t>
       </w:r>
     </w:p>
     <w:p>
@@ -122,7 +123,31 @@
         <w:pStyle w:val="BodyText"/>
       </w:pPr>
       <w:r>
-        <w:t>Status: Standalone normative C48 Version 1 language specification for ZX-UX.</w:t>
+        <w:t>Status: ZX-UX v1 language contract; toolchain and binary formats updated for sdk/rcc, sdk/ras, sdk/rld and sdk/rtap. Conformance remains subject to verified tests.</w:t>
+      </w:r>
+    </w:p>
+    <w:p>
+      <w:pPr>
+        <w:pStyle w:val="BodyText"/>
+      </w:pPr>
+      <w:r>
+        <w:t>Current implementation reference: sdk/README.md and sdk/include/c48.h in the ZX-UX repository.</w:t>
+      </w:r>
+    </w:p>
+    <w:p>
+      <w:pPr>
+        <w:pStyle w:val="BodyText"/>
+      </w:pPr>
+      <w:r>
+        <w:t>Controlling object, executable, tape, memory and loader formats: docs/SPEC-ELASTIC-R2.md (and R1 where incorporated by R2).</w:t>
+      </w:r>
+    </w:p>
+    <w:p>
+      <w:pPr>
+        <w:pStyle w:val="BodyText"/>
+      </w:pPr>
+      <w:r>
+        <w:t>Controlling host compiler, runtime library, calling convention and VM contract: docs/SPEC-SDK-R2.md.</w:t>
       </w:r>
     </w:p>
     <w:p>
@@ -178,17 +203,14 @@
         </w:numPr>
       </w:pPr>
       <w:r>
-        <w:t xml:space="preserve">the native ZX-UX </w:t>
-      </w:r>
-      <w:r>
-        <w:rPr>
-          <w:rStyle w:val="VerbatimChar"/>
-        </w:rPr>
-        <w:t>cc</w:t>
-      </w:r>
-      <w:r>
-        <w:t xml:space="preserve"> compiler can be implemented without inventing missing C language rules;</w:t>
-      </w:r>
+        <w:t>the ZX-UX host compiler rcc can implement the C48 language without inventing missing language rules;</w:t>
+      </w:r>
+      <w:r>
+        <w:rPr>
+          <w:rStyle w:val="VerbatimChar"/>
+        </w:rPr>
+      </w:r>
+      <w:r/>
     </w:p>
     <w:p>
       <w:pPr>
@@ -199,7 +221,7 @@
         </w:numPr>
       </w:pPr>
       <w:r>
-        <w:t>an independent Windows-hosted C48 compiler or interpreter can implement the same language;</w:t>
+        <w:t>an independent host-based C48 compiler or interpreter can implement the same language;</w:t>
       </w:r>
     </w:p>
     <w:p>
@@ -211,7 +233,7 @@
         </w:numPr>
       </w:pPr>
       <w:r>
-        <w:t>a C48 source program accepted by the Windows implementation can later be transferred to ZX-UX and accepted without source changes, subject only to documented implementation resource limits;</w:t>
+        <w:t>a canonical C48 source file can be compiled by ZX-UX sdk/rcc to an SSX1 executable without source changes, subject to documented language/runtime resource limits;</w:t>
       </w:r>
     </w:p>
     <w:p>
@@ -243,23 +265,23 @@
         <w:pStyle w:val="FirstParagraph"/>
       </w:pPr>
       <w:r>
-        <w:t>This specification states the C48 Version 1 language contract in full. It is the controlling definition of C48 language syntax and semantics for both native ZX-UX and independent host implementations.</w:t>
-      </w:r>
-    </w:p>
-    <w:p>
-      <w:pPr>
-        <w:pStyle w:val="BodyText"/>
-      </w:pPr>
-      <w:r>
-        <w:t>This text defines C48 Version 1 language requirements without relying on other documents for their meaning.</w:t>
-      </w:r>
-    </w:p>
-    <w:p>
-      <w:pPr>
-        <w:pStyle w:val="BodyText"/>
-      </w:pPr>
-      <w:r>
-        <w:t>If a target-specific service detail is not specified here, that gap MUST be recorded; an implementation MUST NOT silently invent a new C48 language rule or treat a historical document as controlling.</w:t>
+        <w:t>The language sections freeze C48 Rev 0.11 semantics. The target-specific chapters in this ZX-UX v1 edition use the current SDK architecture and file-format contracts.</w:t>
+      </w:r>
+    </w:p>
+    <w:p>
+      <w:pPr>
+        <w:pStyle w:val="BodyText"/>
+      </w:pPr>
+      <w:r>
+        <w:t>For object layouts, ABI, loader services, memory sizes and tape framing, the checked current ZX-UX R2 documents named above control. Historical Rev17/P11 material does not authorize a separate implementation path.</w:t>
+      </w:r>
+    </w:p>
+    <w:p>
+      <w:pPr>
+        <w:pStyle w:val="BodyText"/>
+      </w:pPr>
+      <w:r>
+        <w:t>If a source-language requirement in this document conflicts with an implemented compiler, record and test the discrepancy; the specification governs language semantics. If a toolchain-format statement conflicts with SPEC-SDK-R2 or SPEC-ELASTIC-R2, their current format contracts govern and the discrepancy must be corrected.</w:t>
       </w:r>
     </w:p>
     <w:p>
@@ -294,7 +316,7 @@
         <w:pStyle w:val="BodyText"/>
       </w:pPr>
       <w:r>
-        <w:t>"Portable C48" means source whose behavior is defined by this specification and which remains within the explicitly stated Version-1 compiler and target resource limits.</w:t>
+        <w:t>"Portable C48" means source whose behavior is defined by this specification and which remains within separately frozen Version-1 compiler resource limits.</w:t>
       </w:r>
     </w:p>
     <w:p>
@@ -318,7 +340,7 @@
         <w:pStyle w:val="BodyText"/>
       </w:pPr>
       <w:r>
-        <w:t>A conforming compiler MUST provide an option or operating mode in which every accepted translation unit obeys exactly this specification. The native ZX-UX compiler operates in that mode unconditionally.</w:t>
+        <w:t>A conforming ZX-UX C48 host compiler MUST implement the accepted source language defined here. Different output backends may be offered only when they preserve language semantics and target the current ZX-UX formats.</w:t>
       </w:r>
     </w:p>
     <w:p/>
@@ -498,15 +520,15 @@
         <w:pStyle w:val="FirstParagraph"/>
       </w:pPr>
       <w:r>
-        <w:t>A Windows-hosted development implementation MAY accept CRLF input as an input convenience, but its strict portability checker MUST report CRLF as noncanonical unless it normalizes the source to LF before transfer.</w:t>
-      </w:r>
-    </w:p>
-    <w:p>
-      <w:pPr>
-        <w:pStyle w:val="BodyText"/>
-      </w:pPr>
-      <w:r>
-        <w:t>The native ZX-UX compiler is required only to accept canonical LF C48 source.</w:t>
+        <w:t>A host compiler MAY accept CRLF files as an input convenience, provided its strict portability check can normalize to canonical LF without changing program meaning.</w:t>
+      </w:r>
+    </w:p>
+    <w:p>
+      <w:pPr>
+        <w:pStyle w:val="BodyText"/>
+      </w:pPr>
+      <w:r>
+        <w:t>Portable C48 source uses canonical LF line endings. Native Z80 compilation of C48 source is not a ZX-UX v1 requirement; sdk/rcc runs on the host.</w:t>
       </w:r>
     </w:p>
     <w:p>
@@ -945,7 +967,7 @@
         <w:pStyle w:val="BodyText"/>
       </w:pPr>
       <w:r>
-        <w:t>The terminating NUL used internally or in an OBJ1 symbol record is not part of this 15-character limit.</w:t>
+        <w:t>A terminating NUL used in an internal or linker symbol representation is not part of this 15-character source-identifier limit.</w:t>
       </w:r>
     </w:p>
     <w:p>
@@ -1021,7 +1043,7 @@
         </w:numPr>
       </w:pPr>
       <w:r>
-        <w:t>silently mapped to an OBJ1-safe alias.</w:t>
+        <w:t>silently mapped to a different linker-visible spelling.</w:t>
       </w:r>
     </w:p>
     <w:p>
@@ -2469,7 +2491,7 @@
       <w:bookmarkStart w:id="18" w:name="floating-literal-representation"/>
       <w:bookmarkEnd w:id="17"/>
       <w:r>
-        <w:t>C48 supports decimal floating literals using the mantissa/exponent grammar also accepted by the canonical SYS_FP_FROM_TEXT numeric parser once any source suffix has been removed.</w:t>
+        <w:t>C48 supports decimal floating literals in the canonical Spectrum-ROM-compatible decimal grammar after removal of any supported source suffix.</w:t>
       </w:r>
     </w:p>
     <w:p>
@@ -2560,7 +2582,7 @@
         <w:pStyle w:val="FirstParagraph"/>
       </w:pPr>
       <w:r>
-        <w:t>Every C48 floating value uses the Spectrum-ROM-compatible five-byte numeric representation specified in Sections 17, 19, 53, 84 and 94.</w:t>
+        <w:t>Every C48 floating value uses the five-byte Spectrum ROM-compatible numeric representation defined here and implemented by the current C48 runtime.</w:t>
       </w:r>
     </w:p>
     <w:p>
@@ -2715,7 +2737,7 @@
         <w:pStyle w:val="BodyText"/>
       </w:pPr>
       <w:r>
-        <w:t>The native compiler may use the controlled ROM conversion service.</w:t>
+        <w:t>The host compiler may use a controlled emulator of the original Spectrum ROM numeric routines for canonical compile-time conversion.</w:t>
       </w:r>
     </w:p>
     <w:p>
@@ -3794,23 +3816,23 @@
         <w:pStyle w:val="Heading2"/>
       </w:pPr>
       <w:r>
-        <w:t>23.2 Linkage, definitions, and OBJ1 symbol spelling</w:t>
-      </w:r>
-    </w:p>
-    <w:p>
-      <w:pPr>
-        <w:pStyle w:val="FirstParagraph"/>
-      </w:pPr>
-      <w:r>
-        <w:t>A file-scope external-linkage object or function definition contributes an OBJ1 GLOBAL definition using the exact C48 source identifier bytes. C48 performs no leading-underscore decoration, case folding, truncation, or host-style name mangling.</w:t>
-      </w:r>
-    </w:p>
-    <w:p>
-      <w:pPr>
-        <w:pStyle w:val="BodyText"/>
-      </w:pPr>
-      <w:r>
-        <w:t>A referenced `extern` entity that is not defined in the translation unit becomes an undefined GLOBAL OBJ1 import using that exact identifier. An unused extern declaration need not create an import. File-scope `static` entities have internal linkage and MUST NOT be exported as OBJ1 GLOBAL definitions; the compiler resolves their internal references within the module or uses non-GLOBAL local OBJ1 symbols as needed.</w:t>
+        <w:t>23.2 Linkage, definitions, and SSO1 symbols</w:t>
+      </w:r>
+    </w:p>
+    <w:p>
+      <w:pPr>
+        <w:pStyle w:val="FirstParagraph"/>
+      </w:pPr>
+      <w:r>
+        <w:t>File-scope external-linkage object or function definitions yield exported symbols in the SSO1 relocatable object that sdk/ras emits. The C48 source identifier remains case-sensitive; the implementation MUST NOT silently truncate, case-fold or alias two distinct source identifiers.</w:t>
+      </w:r>
+    </w:p>
+    <w:p>
+      <w:pPr>
+        <w:pStyle w:val="BodyText"/>
+      </w:pPr>
+      <w:r>
+        <w:t>A referenced unresolved extern becomes an unresolved link symbol; the sdk/rld linker resolves it from input SSO1 objects and SSA1 runtime archives or reports a link error. File-scope static declarations remain internal to their translation unit and are not exported as global linker definitions.</w:t>
       </w:r>
     </w:p>
     <w:p>
@@ -3989,7 +4011,7 @@
         <w:pStyle w:val="BodyText"/>
       </w:pPr>
       <w:r>
-        <w:t>Multiple object-pointer indirection is supported. Implementations may enforce documented bounded compiler capacities; those capacities are resource limits and MUST NOT change pointer types or the language grammar.</w:t>
+        <w:t>Multiple object-pointer indirection is supported. A documented compiler capacity limit must not silently change the language grammar or accept a program with incorrect semantics.</w:t>
       </w:r>
     </w:p>
     <w:p>
@@ -4615,7 +4637,7 @@
         <w:pStyle w:val="BodyText"/>
       </w:pPr>
       <w:r>
-        <w:t>When `main` returns normally, crt0 converts its 16-bit C48 `int` result to the 8-bit process exit status by taking the low eight bits, exactly as an `(unsigned char)` conversion, and passes that byte to SYS_EXIT. Thus `return 0;` yields status 0, `return 1;` yields status 1, and `return 256;` yields status 0.</w:t>
+        <w:t>When main returns normally, crt0 converts the 16-bit C48 int result to an eight-bit process exit status using its low eight bits, then invokes the current ZX-UX exit library/service path. Thus return 0 yields status 0, return 1 yields status 1, and return 256 yields status 0.</w:t>
       </w:r>
     </w:p>
     <w:p/>
@@ -5894,7 +5916,7 @@
         <w:pStyle w:val="BodyText"/>
       </w:pPr>
       <w:r>
-        <w:t>These promotions do NOT erase the C48 8-bit shift rule. For `&lt;&lt;` and `&gt;&gt;`, Section 46 deliberately uses the unpromoted left operand type and width. An 8-bit `char`/`unsigned char` shift uses the low three count bits; a 16-bit shift uses the low four bits.</w:t>
+        <w:t>These promotions do NOT erase the deliberate 8-bit shift behavior. For &lt;&lt; and &gt;&gt;, Section 46 uses the unpromoted left operand type and width, including the low-three-bit shift count for an 8-bit char and the low-four-bit shift count for a 16-bit operand.</w:t>
       </w:r>
     </w:p>
     <w:p>
@@ -6020,15 +6042,15 @@
         <w:pStyle w:val="BodyText"/>
       </w:pPr>
       <w:r>
-        <w:t>Integer-to-float conversion passes signed `short`/`int` through the signed SYS_INT_TO_FP path and passes `char`, `unsigned char`, `unsigned short`, and `unsigned int` through the unsigned path after the value has been represented in a 16-bit slot.</w:t>
-      </w:r>
-    </w:p>
-    <w:p>
-      <w:pPr>
-        <w:pStyle w:val="BodyText"/>
-      </w:pPr>
-      <w:r>
-        <w:t>For float-to-integer conversion, `short`/`int` require the truncated mathematical result in -32768..32767. `unsigned short`/`unsigned int` require 0..65535. Conversion to `char` or `unsigned char` first uses the unsigned 0..65535 SYS_FP_TO_INT domain and then keeps the low eight bits by Section 43. Therefore `(char)300.0` is 44, while `(char)-1.0` is a range failure.</w:t>
+        <w:t>Integer-to-float conversions use the signed path for short/int and the unsigned path for char, unsigned char, unsigned short, and unsigned int. The current runtime uses Spectrum-ROM-compatible five-byte arithmetic and preserves the C48 source type rules.</w:t>
+      </w:r>
+    </w:p>
+    <w:p>
+      <w:pPr>
+        <w:pStyle w:val="BodyText"/>
+      </w:pPr>
+      <w:r>
+        <w:t>For float-to-integer conversion, short/int require a truncated result in -32768..32767. Unsigned short/unsigned int require 0..65535. Conversion to char or unsigned char first uses the unsigned 0..65535 domain, then retains the low eight bits under Section 43. Hence (char)300.0 is 44, while (char)-1.0 fails conversion.</w:t>
       </w:r>
     </w:p>
     <w:p/>
@@ -6161,7 +6183,7 @@
         <w:pStyle w:val="BodyText"/>
       </w:pPr>
       <w:r>
-        <w:t>The right operand must be integer-valued and is converted only for obtaining the count; its signedness does not create an error because only the low count bits defined in this Section are used.</w:t>
+        <w:t>The right operand must be integer-valued and is converted only for obtaining the count; its signedness does not create an error because only the architecture-defined low count bits are used.</w:t>
       </w:r>
     </w:p>
     <w:p>
@@ -6820,7 +6842,7 @@
         <w:pStyle w:val="BodyText"/>
       </w:pPr>
       <w:r>
-        <w:t>Floating-to-integer conversion truncates toward zero. The underlying SYS_FP_TO_INT conversion accepts signed results only in -32768..32767 and unsigned results only in 0..65535. An invalid/out-of-range syscall conversion leaves its destination unchanged.</w:t>
+        <w:t>Floating-to-integer conversion truncates toward zero. Signed conversion accepts -32768..32767 and unsigned conversion 0..65535. A failed numeric conversion takes the documented C48 runtime-error path, without exposing uninitialized result data.</w:t>
       </w:r>
     </w:p>
     <w:p>
@@ -6956,7 +6978,7 @@
         <w:pStyle w:val="BodyText"/>
       </w:pPr>
       <w:r>
-        <w:t>Function arguments are evaluated and their argument values captured left-to-right. Later argument evaluation therefore cannot retroactively change an already captured earlier argument value. Physical placement of fourth-and-later ABI arguments on the stack right-to-left does not alter source evaluation order.</w:t>
+        <w:t>Function arguments are evaluated and captured left-to-right. The current rcc ABI pushes all but the last argument in that order and passes the final argument in HL; physical stack placement does not change source evaluation order.</w:t>
       </w:r>
     </w:p>
     <w:p>
@@ -7023,7 +7045,7 @@
         <w:pStyle w:val="BodyText"/>
       </w:pPr>
       <w:r>
-        <w:t>The float ABI does not change this language rule. Although C48_REGCALL physically passes a float argument as a 16-bit pointer to caller-owned five-byte value storage, generated code MUST preserve pass-by-value semantics: any callee assignment to its float parameter must affect only the callee's parameter value, not the caller's source float object. The compiler may satisfy this with caller temporaries, callee copies, or another ABI-equivalent implementation.</w:t>
+        <w:t>Float parameters retain C48 pass-by-value semantics. The ZX-UX rcc ABI transports a float argument through a pointer to its five-byte value; generated code MUST preserve callee-local parameter assignment and must not mutate a caller object except through an explicitly passed pointer.</w:t>
       </w:r>
     </w:p>
     <w:p>
@@ -7040,15 +7062,15 @@
         <w:pStyle w:val="Heading1"/>
       </w:pPr>
       <w:r>
-        <w:t>57. C48_REGCALL</w:t>
-      </w:r>
-    </w:p>
-    <w:p>
-      <w:pPr>
-        <w:pStyle w:val="FirstParagraph"/>
-      </w:pPr>
-      <w:r>
-        <w:t>The externally linkable calling convention is exactly:</w:t>
+        <w:t>57. ZX-UX rcc native calling convention</w:t>
+      </w:r>
+    </w:p>
+    <w:p>
+      <w:pPr>
+        <w:pStyle w:val="FirstParagraph"/>
+      </w:pPr>
+      <w:r>
+        <w:t>The current ZX-UX C48 native calling convention is defined by docs/SPEC-SDK-R2.md, Section 3. It is used by compiled native routines and the linked SDK runtime.</w:t>
       </w:r>
     </w:p>
     <w:p>
@@ -7059,15 +7081,15 @@
         <w:rPr>
           <w:rStyle w:val="VerbatimChar"/>
         </w:rPr>
-        <w:t>C48_REGCALL</w:t>
-      </w:r>
-    </w:p>
-    <w:p>
-      <w:pPr>
-        <w:pStyle w:val="FirstParagraph"/>
-      </w:pPr>
-      <w:r>
-        <w:t>For ordinary scalar and pointer argument slots:</w:t>
+        <w:t>ZX-UX rcc ABI (not the historical C48_REGCALL convention)</w:t>
+      </w:r>
+    </w:p>
+    <w:p>
+      <w:pPr>
+        <w:pStyle w:val="FirstParagraph"/>
+      </w:pPr>
+      <w:r>
+        <w:t>Arguments are evaluated left-to-right. For n arguments, arguments 1 through n-1 are pushed in that same order as 16-bit words; the last argument is passed in HL. With no arguments there is no HL parameter.</w:t>
       </w:r>
     </w:p>
     <w:p>
@@ -7078,99 +7100,87 @@
         <w:rPr>
           <w:rStyle w:val="VerbatimChar"/>
         </w:rPr>
-        <w:t>first argument      HL</w:t>
-      </w:r>
-      <w:r>
-        <w:br/>
-      </w:r>
-      <w:r>
-        <w:rPr>
-          <w:rStyle w:val="VerbatimChar"/>
-        </w:rPr>
-        <w:t>second argument     DE</w:t>
-      </w:r>
-      <w:r>
-        <w:br/>
-      </w:r>
-      <w:r>
-        <w:rPr>
-          <w:rStyle w:val="VerbatimChar"/>
-        </w:rPr>
-        <w:t>third argument      BC</w:t>
-      </w:r>
-      <w:r>
-        <w:br/>
-      </w:r>
-      <w:r>
-        <w:rPr>
-          <w:rStyle w:val="VerbatimChar"/>
-        </w:rPr>
-        <w:t>remaining arguments stack words, right-to-left</w:t>
-      </w:r>
-    </w:p>
-    <w:p>
-      <w:pPr>
-        <w:pStyle w:val="FirstParagraph"/>
-      </w:pPr>
-      <w:r>
-        <w:t>Every ordinary scalar/pointer argument occupies one 16-bit call slot.</w:t>
-      </w:r>
-    </w:p>
-    <w:p>
-      <w:pPr>
-        <w:pStyle w:val="BodyText"/>
-      </w:pPr>
-      <w:r>
-        <w:t>An 8-bit argument is zero-extended into its 16-bit slot.</w:t>
-      </w:r>
-    </w:p>
-    <w:p>
-      <w:pPr>
-        <w:pStyle w:val="BodyText"/>
-      </w:pPr>
-      <w:r>
-        <w:t>The caller removes stack argument words.</w:t>
-      </w:r>
-    </w:p>
-    <w:p>
-      <w:pPr>
-        <w:pStyle w:val="BodyText"/>
-      </w:pPr>
-      <w:r>
-        <w:t>SP is even-aligned at every C48 call boundary.</w:t>
-      </w:r>
-    </w:p>
-    <w:p>
-      <w:pPr>
-        <w:pStyle w:val="BodyText"/>
-      </w:pPr>
-      <w:r>
-        <w:t xml:space="preserve">A </w:t>
-      </w:r>
-      <w:r>
-        <w:rPr>
-          <w:rStyle w:val="VerbatimChar"/>
-        </w:rPr>
-        <w:t>float</w:t>
-      </w:r>
-      <w:r>
-        <w:t xml:space="preserve"> argument is represented by a pointer to caller-owned five-byte storage and consumes one normal 16-bit argument slot.</w:t>
-      </w:r>
-    </w:p>
-    <w:p>
-      <w:pPr>
-        <w:pStyle w:val="BodyText"/>
-      </w:pPr>
-      <w:r>
-        <w:t>There is no CDECL alternative.</w:t>
-      </w:r>
-    </w:p>
-    <w:p>
-      <w:pPr>
-        <w:pStyle w:val="BodyText"/>
-      </w:pPr>
-      <w:r>
-        <w:t>No source syntax exists for selecting another calling convention.</w:t>
+        <w:t>C48 argument word layout: preceding arguments on the stack; final argument in HL. There is no HL/DE/BC three-register argument scheme.</w:t>
+      </w:r>
+      <w:r/>
+      <w:r>
+        <w:rPr>
+          <w:rStyle w:val="VerbatimChar"/>
+        </w:rPr>
+      </w:r>
+      <w:r/>
+      <w:r>
+        <w:rPr>
+          <w:rStyle w:val="VerbatimChar"/>
+        </w:rPr>
+      </w:r>
+      <w:r/>
+      <w:r>
+        <w:rPr>
+          <w:rStyle w:val="VerbatimChar"/>
+        </w:rPr>
+      </w:r>
+    </w:p>
+    <w:p>
+      <w:pPr>
+        <w:pStyle w:val="FirstParagraph"/>
+      </w:pPr>
+      <w:r>
+        <w:t>Ordinary scalar and pointer values occupy 16-bit argument words; float values are supplied by a pointer to caller-owned five-byte storage and copied as needed to preserve language-level pass-by-value behavior.</w:t>
+      </w:r>
+    </w:p>
+    <w:p>
+      <w:pPr>
+        <w:pStyle w:val="BodyText"/>
+      </w:pPr>
+      <w:r>
+        <w:t>An 8-bit argument is zero-extended when represented in a 16-bit argument word.</w:t>
+      </w:r>
+    </w:p>
+    <w:p>
+      <w:pPr>
+        <w:pStyle w:val="BodyText"/>
+      </w:pPr>
+      <w:r>
+        <w:t>The callee removes the pushed argument words under the rcc calling convention.</w:t>
+      </w:r>
+    </w:p>
+    <w:p>
+      <w:pPr>
+        <w:pStyle w:val="BodyText"/>
+      </w:pPr>
+      <w:r>
+        <w:t>The runtime stack and recursive IX frame are maintained according to SPEC-SDK-R2 Section 3. A separate historical even-SP call boundary rule is not imposed here.</w:t>
+      </w:r>
+    </w:p>
+    <w:p>
+      <w:pPr>
+        <w:pStyle w:val="BodyText"/>
+      </w:pPr>
+      <w:r>
+        <w:t>The current native/SSB1 interoperation uses the same rcc ABI; the SSB1 dispatch and frame rules are defined by SPEC-SDK-R2 Section 6.</w:t>
+      </w:r>
+      <w:r>
+        <w:rPr>
+          <w:rStyle w:val="VerbatimChar"/>
+        </w:rPr>
+      </w:r>
+      <w:r/>
+    </w:p>
+    <w:p>
+      <w:pPr>
+        <w:pStyle w:val="BodyText"/>
+      </w:pPr>
+      <w:r>
+        <w:t>The historical C48_REGCALL and CDECL alternatives are not supported ZX-UX v1 calling conventions.</w:t>
+      </w:r>
+    </w:p>
+    <w:p>
+      <w:pPr>
+        <w:pStyle w:val="BodyText"/>
+      </w:pPr>
+      <w:r>
+        <w:t>C48 source provides no calling-convention selection syntax.</w:t>
       </w:r>
     </w:p>
     <w:p/>
@@ -7181,15 +7191,15 @@
       <w:bookmarkStart w:id="59" w:name="function-return-abi"/>
       <w:bookmarkEnd w:id="58"/>
       <w:r>
-        <w:t>58. Function return ABI</w:t>
-      </w:r>
-    </w:p>
-    <w:p>
-      <w:pPr>
-        <w:pStyle w:val="FirstParagraph"/>
-      </w:pPr>
-      <w:r>
-        <w:t>Return representation is:</w:t>
+        <w:t>58. ZX-UX rcc return ABI</w:t>
+      </w:r>
+    </w:p>
+    <w:p>
+      <w:pPr>
+        <w:pStyle w:val="FirstParagraph"/>
+      </w:pPr>
+      <w:r>
+        <w:t>The current SDK returns ordinary scalar and pointer values in HL, with H=0 for an 8-bit result. Floating-point results are stored in the runtime @fac value area under the current SDK contract.</w:t>
       </w:r>
     </w:p>
     <w:p>
@@ -7200,59 +7210,47 @@
         <w:rPr>
           <w:rStyle w:val="VerbatimChar"/>
         </w:rPr>
-        <w:t>void             no value</w:t>
-      </w:r>
-      <w:r>
-        <w:br/>
-      </w:r>
-      <w:r>
-        <w:rPr>
-          <w:rStyle w:val="VerbatimChar"/>
-        </w:rPr>
-        <w:t>8-bit scalar     L</w:t>
-      </w:r>
-      <w:r>
-        <w:br/>
-      </w:r>
-      <w:r>
-        <w:rPr>
-          <w:rStyle w:val="VerbatimChar"/>
-        </w:rPr>
-        <w:t>16-bit scalar    HL</w:t>
-      </w:r>
-      <w:r>
-        <w:br/>
-      </w:r>
-      <w:r>
-        <w:rPr>
-          <w:rStyle w:val="VerbatimChar"/>
-        </w:rPr>
-        <w:t>pointer          HL</w:t>
-      </w:r>
-    </w:p>
-    <w:p>
-      <w:pPr>
-        <w:pStyle w:val="FirstParagraph"/>
-      </w:pPr>
-      <w:r>
-        <w:t xml:space="preserve">A function returning </w:t>
-      </w:r>
-      <w:r>
-        <w:rPr>
-          <w:rStyle w:val="VerbatimChar"/>
-        </w:rPr>
-        <w:t>float</w:t>
-      </w:r>
-      <w:r>
-        <w:t xml:space="preserve"> receives a hidden first argument containing a pointer to caller-provided five-byte result storage.</w:t>
-      </w:r>
-    </w:p>
-    <w:p>
-      <w:pPr>
-        <w:pStyle w:val="BodyText"/>
-      </w:pPr>
-      <w:r>
-        <w:t>That hidden pointer occupies HL and moves user arguments to:</w:t>
+        <w:t>void: no value; 8-bit scalar: HL with H=0; 16-bit scalar: HL; pointer: HL; float: five-byte result in @fac.</w:t>
+      </w:r>
+      <w:r/>
+      <w:r>
+        <w:rPr>
+          <w:rStyle w:val="VerbatimChar"/>
+        </w:rPr>
+      </w:r>
+      <w:r/>
+      <w:r>
+        <w:rPr>
+          <w:rStyle w:val="VerbatimChar"/>
+        </w:rPr>
+      </w:r>
+      <w:r/>
+      <w:r>
+        <w:rPr>
+          <w:rStyle w:val="VerbatimChar"/>
+        </w:rPr>
+      </w:r>
+    </w:p>
+    <w:p>
+      <w:pPr>
+        <w:pStyle w:val="FirstParagraph"/>
+      </w:pPr>
+      <w:r>
+        <w:t>The current rcc float-return ABI uses the runtime five-byte @fac area, not a hidden first result-pointer argument.</w:t>
+      </w:r>
+      <w:r>
+        <w:rPr>
+          <w:rStyle w:val="VerbatimChar"/>
+        </w:rPr>
+      </w:r>
+      <w:r/>
+    </w:p>
+    <w:p>
+      <w:pPr>
+        <w:pStyle w:val="BodyText"/>
+      </w:pPr>
+      <w:r>
+        <w:t>A float return does not shift the user argument registers or introduce an extra call slot.</w:t>
       </w:r>
     </w:p>
     <w:p>
@@ -7263,41 +7261,35 @@
         <w:rPr>
           <w:rStyle w:val="VerbatimChar"/>
         </w:rPr>
-        <w:t>DE</w:t>
-      </w:r>
-      <w:r>
-        <w:br/>
-      </w:r>
-      <w:r>
-        <w:rPr>
-          <w:rStyle w:val="VerbatimChar"/>
-        </w:rPr>
-        <w:t>BC</w:t>
-      </w:r>
-      <w:r>
-        <w:br/>
-      </w:r>
-      <w:r>
-        <w:rPr>
-          <w:rStyle w:val="VerbatimChar"/>
-        </w:rPr>
-        <w:t>stack</w:t>
-      </w:r>
-    </w:p>
-    <w:p>
-      <w:pPr>
-        <w:pStyle w:val="FirstParagraph"/>
-      </w:pPr>
-      <w:r>
-        <w:t>The callee writes exactly five result bytes and returns the same result pointer in HL.</w:t>
-      </w:r>
-    </w:p>
-    <w:p>
-      <w:pPr>
-        <w:pStyle w:val="BodyText"/>
-      </w:pPr>
-      <w:r>
-        <w:t>For an 8-bit `char`/`unsigned char` return only register L is defined by C48_REGCALL; H is unspecified at the ABI boundary. A conforming C48 caller that needs the returned value in a 16-bit expression must zero-extend L according to the normal unsigned 8-bit promotion rule rather than relying on H.</w:t>
+        <w:t>The final user argument is in HL when at least one argument is supplied.</w:t>
+      </w:r>
+      <w:r/>
+      <w:r>
+        <w:rPr>
+          <w:rStyle w:val="VerbatimChar"/>
+        </w:rPr>
+      </w:r>
+      <w:r/>
+      <w:r>
+        <w:rPr>
+          <w:rStyle w:val="VerbatimChar"/>
+        </w:rPr>
+      </w:r>
+    </w:p>
+    <w:p>
+      <w:pPr>
+        <w:pStyle w:val="FirstParagraph"/>
+      </w:pPr>
+      <w:r>
+        <w:t>The returned five-byte float is consumed through the documented runtime @fac convention; generated code must preserve the source-level value before operations that overwrite @fac.</w:t>
+      </w:r>
+    </w:p>
+    <w:p>
+      <w:pPr>
+        <w:pStyle w:val="BodyText"/>
+      </w:pPr>
+      <w:r>
+        <w:t>An 8-bit char/unsigned char return uses HL with H=0 in the current ABI, allowing normal unsigned promotion. Generated callers must still implement the C48 source type and conversion rules.</w:t>
       </w:r>
     </w:p>
     <w:p/>
@@ -7308,15 +7300,15 @@
       <w:bookmarkStart w:id="60" w:name="register-ownership"/>
       <w:bookmarkEnd w:id="59"/>
       <w:r>
-        <w:t>59. Register ownership</w:t>
-      </w:r>
-    </w:p>
-    <w:p>
-      <w:pPr>
-        <w:pStyle w:val="FirstParagraph"/>
-      </w:pPr>
-      <w:r>
-        <w:t>At a C48 external call boundary:</w:t>
+        <w:t>59. ZX-UX register ownership</w:t>
+      </w:r>
+    </w:p>
+    <w:p>
+      <w:pPr>
+        <w:pStyle w:val="FirstParagraph"/>
+      </w:pPr>
+      <w:r>
+        <w:t>At the current SDK call boundary, IX is callee-preserved; other ordinary registers may be clobbered. The 48K ROM and ZX-UX kernel retain their reserved register requirements.</w:t>
       </w:r>
     </w:p>
     <w:p>
@@ -7327,34 +7319,25 @@
         <w:rPr>
           <w:rStyle w:val="VerbatimChar"/>
         </w:rPr>
-        <w:t>AF BC DE HL      caller-clobbered</w:t>
-      </w:r>
-      <w:r>
-        <w:br/>
-      </w:r>
-      <w:r>
-        <w:rPr>
-          <w:rStyle w:val="VerbatimChar"/>
-        </w:rPr>
-        <w:t>IX               callee-preserved when used</w:t>
-      </w:r>
-      <w:r>
-        <w:br/>
-      </w:r>
-      <w:r>
-        <w:rPr>
-          <w:rStyle w:val="VerbatimChar"/>
-        </w:rPr>
-        <w:t>IY               ZX-UX/ROM reserved</w:t>
-      </w:r>
-      <w:r>
-        <w:br/>
-      </w:r>
-      <w:r>
-        <w:rPr>
-          <w:rStyle w:val="VerbatimChar"/>
-        </w:rPr>
-        <w:t>alternate bank   ZX-UX private</w:t>
+        <w:t>AF, BC, DE, HL: caller-clobbered. IX: callee-preserved. IY and the alternate register bank: reserved by ZX-UX/ROM as documented by the SDK.</w:t>
+      </w:r>
+      <w:r/>
+      <w:r>
+        <w:rPr>
+          <w:rStyle w:val="VerbatimChar"/>
+        </w:rPr>
+      </w:r>
+      <w:r/>
+      <w:r>
+        <w:rPr>
+          <w:rStyle w:val="VerbatimChar"/>
+        </w:rPr>
+      </w:r>
+      <w:r/>
+      <w:r>
+        <w:rPr>
+          <w:rStyle w:val="VerbatimChar"/>
+        </w:rPr>
       </w:r>
     </w:p>
     <w:p>
@@ -7370,15 +7353,15 @@
         <w:pStyle w:val="BodyText"/>
       </w:pPr>
       <w:r>
-        <w:t>Conforming code MUST NOT depend on AF'/BC'/DE'/HL' retaining values across calls, syscalls, interrupts, or task activity.</w:t>
-      </w:r>
-    </w:p>
-    <w:p>
-      <w:pPr>
-        <w:pStyle w:val="BodyText"/>
-      </w:pPr>
-      <w:r>
-        <w:t>These rules apply to hand-written assembly intended to interoperate with C48.</w:t>
+        <w:t>C48 code MUST NOT depend on alternate AF/BC/DE/HL values surviving calls, kernel services, interrupts, or multitasking.</w:t>
+      </w:r>
+    </w:p>
+    <w:p>
+      <w:pPr>
+        <w:pStyle w:val="BodyText"/>
+      </w:pPr>
+      <w:r>
+        <w:t>Hand-written assembly that interoperates with C48 must obey SPEC-SDK-R2 Section 3 and the ZX-UX kernel conventions.</w:t>
       </w:r>
     </w:p>
     <w:p/>
@@ -8346,7 +8329,7 @@
         <w:pStyle w:val="BodyText"/>
       </w:pPr>
       <w:r>
-        <w:t>Returning from `main` through its explicit `int` result reaches crt0, which routes program termination through SYS_EXIT rather than returning to loader state. The shipped canonical `hello.c` remains required to contain explicit `return 0;`.</w:t>
+        <w:t>Returning from main reaches the current crt0 startup/exit runtime path, rather than returning to the executable loader. The canonical hello example uses explicit return 0.</w:t>
       </w:r>
     </w:p>
     <w:p/>
@@ -8365,7 +8348,7 @@
       <w:bookmarkStart w:id="72" w:name="define"/>
       <w:bookmarkEnd w:id="71"/>
       <w:r>
-        <w:t>C48 has a deliberately small, token-based preprocessor integrated into `cc`. Supported directives are exactly `#define` and `#include`.</w:t>
+        <w:t>C48 has a deliberately small, token-based preprocessor in the host compiler sdk/rcc. The language directives are #define and #include as specified here.</w:t>
       </w:r>
     </w:p>
     <w:p>
@@ -8576,23 +8559,23 @@
         <w:pStyle w:val="BodyText"/>
       </w:pPr>
       <w:r>
-        <w:t>The name is exact and case-sensitive, is 1..10 portable namespace characters, and uses only `A-Z a-z 0-9 _ - .`, excluding exact `.` and `..`. It resolves only in the current ZX-UX directory; PATH and system-header searching do not apply.</w:t>
-      </w:r>
-    </w:p>
-    <w:p>
-      <w:pPr>
-        <w:pStyle w:val="BodyText"/>
-      </w:pPr>
-      <w:r>
-        <w:t>A local include object MUST be an ordinary text-bearing TXT or C object. RAW and transparently PACKED representations are both accepted through ordinary logical reads. ASM, CFG, BIN, OBJ, DAT, and other object types are rejected as local C48 includes.</w:t>
-      </w:r>
-    </w:p>
-    <w:p>
-      <w:pPr>
-        <w:pStyle w:val="BodyText"/>
-      </w:pPr>
-      <w:r>
-        <w:t>Local include nesting depth is exactly one. The primary translation unit may include a local file. A locally included file MUST NOT include another quoted local file. It MAY include built-in `&lt;c48.h&gt;` because that include is compiler-resident rather than another local object. Direct/indirect local-include cycles are therefore rejected.</w:t>
+        <w:t>A quoted local include names a host source file resolved by sdk/rcc according to its source/include rules; file-system path constraints must be checked for the actual host and the target file API separately. Historical ZX-UX object-type and basename restrictions are not rules for the host source file path.</w:t>
+      </w:r>
+    </w:p>
+    <w:p>
+      <w:pPr>
+        <w:pStyle w:val="BodyText"/>
+      </w:pPr>
+      <w:r>
+        <w:t>A quoted include supplies source text. The host preprocessor does not require a RAM/tape object-type tag. If a target-side source import is later implemented, it must normalize logical source bytes before lexing and cannot substitute an obsolete object-format decoder.</w:t>
+      </w:r>
+    </w:p>
+    <w:p>
+      <w:pPr>
+        <w:pStyle w:val="BodyText"/>
+      </w:pPr>
+      <w:r>
+        <w:t>The C48 strict-portability profile limits nested quoted includes as specified here; the built-in &lt;c48.h&gt; is a separate runtime declaration source. Additional host-only include behaviors are not claimed as strict C48 conformance without tests.</w:t>
       </w:r>
     </w:p>
     <w:p>
@@ -8641,7 +8624,7 @@
         <w:pStyle w:val="BodyText"/>
       </w:pPr>
       <w:r>
-        <w:t>`&lt;c48.h&gt;` is a compiler-resident declaration source and is never loaded from a RAM/tape object. It is processed logically at the include point using the current macro/declaration environment. Repeated inclusion is idempotent.</w:t>
+        <w:t>The built-in &lt;c48.h&gt; interface is supplied by sdk/include/c48.h for the current host SDK; it is not a BIN/OBJ cassette object. Any alternate header loader must expose the same C48 prototypes and semantics.</w:t>
       </w:r>
     </w:p>
     <w:p>
@@ -8657,15 +8640,15 @@
         <w:pStyle w:val="BodyText"/>
       </w:pPr>
       <w:r>
-        <w:t>The only built-in angle-bracket header, `&lt;c48.h&gt;`, exposes the mandatory public runtime names enumerated in Appendix B. This specification freezes their names and the language-level rules for declarations; it does not assert unpublished prototypes, parameter types, constants, errno/flag values, or supporting records. Such absent interface definitions MUST be recorded as unresolved target-runtime details rather than invented language syntax.</w:t>
-      </w:r>
-    </w:p>
-    <w:p>
-      <w:pPr>
-        <w:pStyle w:val="BodyText"/>
-      </w:pPr>
-      <w:r>
-        <w:t>Appendix B records the mandatory public-name inventory. Explanatory ABI notation that uses an unsupported type modifier such as `const`, or an incomplete pseudo-prototype, is not valid C48 source syntax; see Sections 96-97.</w:t>
+        <w:t>The authoritative public header for this ZX-UX v1 toolchain is sdk/include/c48.h. Each exported prototype must match the checked runtime archive sdk/lib/libc48.ssa. Earlier historical public-name lists do not create missing v1 services.</w:t>
+      </w:r>
+    </w:p>
+    <w:p>
+      <w:pPr>
+        <w:pStyle w:val="BodyText"/>
+      </w:pPr>
+      <w:r>
+        <w:t>Appendix B names the current public header functions. Unsupported modifier spellings, including const, do not become C48 grammar merely because they appear in old reference pseudocode.</w:t>
       </w:r>
     </w:p>
     <w:p/>
@@ -9134,31 +9117,31 @@
       <w:bookmarkStart w:id="79" w:name="compiler-architecture-invariants"/>
       <w:bookmarkEnd w:id="78"/>
       <w:r>
-        <w:t>The language grammar does not impose a three- or six-argument maximum merely because the first three argument slots are registers or because the acceptance suite exercises 0..6 arguments. Additional arguments use the C48_REGCALL stack slots.</w:t>
-      </w:r>
-    </w:p>
-    <w:p>
-      <w:pPr>
-        <w:pStyle w:val="BodyText"/>
-      </w:pPr>
-      <w:r>
-        <w:t>The Version-1 native compiler MUST use bounded capacities for globals/externs, locals, generated labels, expression trees, type/declarator representation, macro tables, include buffering, literals, and other finite compiler tables within the 20 KiB total process-owned compiler footprint stated below. Concrete table capacities MUST be declared and checked by each native compiler release; they MUST NOT silently alter C48 language grammar.</w:t>
-      </w:r>
-    </w:p>
-    <w:p>
-      <w:pPr>
-        <w:pStyle w:val="BodyText"/>
-      </w:pPr>
-      <w:r>
-        <w:t>The compiler's complete process-owned live footprint -- image+BSS, FAST stack, read-only ARG1/ENV1 allocation, and compiler-internal dynamic workspace -- has the exact release target &lt;=20480 bytes. Failure for insufficient compiler memory is recoverable and must expose the clear `not enough memory for compiler` condition rather than corruption.</w:t>
-      </w:r>
-    </w:p>
-    <w:p>
-      <w:pPr>
-        <w:pStyle w:val="BodyText"/>
-      </w:pPr>
-      <w:r>
-        <w:t>A strict host portability implementation MUST enforce the documented capacities of the native compiler release against which it claims compatibility. If a capacity has not been published, the host MUST report that limit as unverified rather than invent a permanent grammatical restriction.</w:t>
+        <w:t>The C48 grammar has no arbitrary three- or six-argument limit. Under the current rcc ABI, each argument except the last occupies a stack word, and the final argument is passed in HL. Actual memory limits are enforced by current linker/runtime contracts.</w:t>
+      </w:r>
+    </w:p>
+    <w:p>
+      <w:pPr>
+        <w:pStyle w:val="BodyText"/>
+      </w:pPr>
+      <w:r>
+        <w:t>Compiler resource limits are implementation limits, not new source-language productions. Host rcc may use host memory; target program image, BSS, heap and stack are bounded by the 48K memory/loader model in SPEC-ELASTIC-R2.</w:t>
+      </w:r>
+    </w:p>
+    <w:p>
+      <w:pPr>
+        <w:pStyle w:val="BodyText"/>
+      </w:pPr>
+      <w:r>
+        <w:t>The historical native-compiler resident-memory cap is not a requirement of the current host compiler. A C48 program must fit the memory available to its ZX-UX process; the rcc default selection threshold is 14,000 bytes and can select SSB1 bytecode when smaller.</w:t>
+      </w:r>
+    </w:p>
+    <w:p>
+      <w:pPr>
+        <w:pStyle w:val="BodyText"/>
+      </w:pPr>
+      <w:r>
+        <w:t>Strict portability checking must report a genuine target size or runtime limitation without falsely rejecting otherwise legal C48 syntax. Current SDK option limits do not broaden the language.</w:t>
       </w:r>
     </w:p>
     <w:p/>
@@ -9167,15 +9150,17 @@
         <w:pStyle w:val="Heading1"/>
       </w:pPr>
       <w:r>
-        <w:t>78. Compiler architecture invariants</w:t>
-      </w:r>
-    </w:p>
-    <w:p>
-      <w:pPr>
-        <w:pStyle w:val="FirstParagraph"/>
-      </w:pPr>
-      <w:r>
-        <w:t>The complete native compiler front-end/backend flow is:</w:t>
+        <w:t>78. Current ZX-UX compiler architecture</w:t>
+      </w:r>
+    </w:p>
+    <w:p>
+      <w:pPr>
+        <w:pStyle w:val="FirstParagraph"/>
+      </w:pPr>
+      <w:bookmarkStart w:id="80" w:name="output-model"/>
+      <w:bookmarkEnd w:id="79"/>
+      <w:r>
+        <w:t>The host development flow is defined by sdk/rcc/driver.py and docs/SPEC-SDK-R2.md:</w:t>
       </w:r>
     </w:p>
     <w:p>
@@ -9183,47 +9168,29 @@
         <w:pStyle w:val="SourceCode"/>
       </w:pPr>
       <w:r>
-        <w:t>source logical-read stream</w:t>
-      </w:r>
-      <w:r>
-        <w:br/>
-        <w:t xml:space="preserve">    -&gt; preprocessing scanner / directive and include expansion</w:t>
-      </w:r>
-      <w:r>
-        <w:br/>
-        <w:t xml:space="preserve">    -&gt; C48 lexer</w:t>
-      </w:r>
-      <w:r>
-        <w:br/>
-        <w:t xml:space="preserve">    -&gt; recursive-descent parser</w:t>
-      </w:r>
-      <w:r>
-        <w:br/>
-        <w:t xml:space="preserve">    -&gt; bounded expression tree / direct emission</w:t>
-      </w:r>
-      <w:r>
-        <w:br/>
-        <w:t xml:space="preserve">    -&gt; symbolic Z80 emitter</w:t>
-      </w:r>
-      <w:r>
-        <w:br/>
-        <w:t xml:space="preserve">    -&gt; OBJ1 writer</w:t>
-      </w:r>
-    </w:p>
-    <w:p>
-      <w:pPr>
-        <w:pStyle w:val="FirstParagraph"/>
-      </w:pPr>
-      <w:r>
-        <w:t>The preprocessing scanner performs only the lexical recognition needed to protect comments/literals, recognize directives, and expand object-like constant tokens; the C48 lexer then emits the language tokens defined by this specification. Both stages are streaming and bounded.</w:t>
-      </w:r>
-    </w:p>
-    <w:p>
-      <w:pPr>
-        <w:pStyle w:val="BodyText"/>
-      </w:pPr>
-      <w:r>
-        <w:t>No language rule authorizes whole-source materialization or a whole-program AST. Statements compile incrementally; expression storage is bounded and released promptly. Concrete resource capacities are reported and tested as compiler implementation limits.</w:t>
+        <w:t>C48 host source -&gt; preprocess/lex -&gt; parse/type-check -&gt; Z80 native generator or SSB1 bytecode generator -&gt; sdk/ras -&gt; SSO1 object -&gt; sdk/rld + SSA1 runtime archive -&gt; SSX1 executable -&gt; sdk/rtap SST1 cassette record.</w:t>
+      </w:r>
+      <w:r/>
+      <w:r/>
+      <w:r/>
+      <w:r/>
+      <w:r/>
+      <w:r/>
+    </w:p>
+    <w:p>
+      <w:pPr>
+        <w:pStyle w:val="FirstParagraph"/>
+      </w:pPr>
+      <w:r>
+        <w:t>The source-language behavior of the preprocessor, lexer and parser follows the C48 requirements in this specification. Their internal data structures and buffering are implementation details.</w:t>
+      </w:r>
+    </w:p>
+    <w:p>
+      <w:pPr>
+        <w:pStyle w:val="BodyText"/>
+      </w:pPr>
+      <w:r>
+        <w:t>The host compiler is not subject to the abandoned on-machine streaming-compiler design. Large source files and translation units remain subject to actual host and 48K program memory constraints.</w:t>
       </w:r>
     </w:p>
     <w:p/>
@@ -9232,7 +9199,7 @@
         <w:pStyle w:val="Heading1"/>
       </w:pPr>
       <w:r>
-        <w:t>79. Output model</w:t>
+        <w:t>79. Current ZX-UX output model and load path</w:t>
       </w:r>
     </w:p>
     <w:p>
@@ -9242,71 +9209,71 @@
       <w:bookmarkStart w:id="81" w:name="diagnostics"/>
       <w:bookmarkEnd w:id="80"/>
       <w:r>
-        <w:t>The native command is `cc`. It accepts exactly one C-typed input object.</w:t>
-      </w:r>
-    </w:p>
-    <w:p>
-      <w:pPr>
-        <w:pStyle w:val="BodyText"/>
-      </w:pPr>
-      <w:r>
-        <w:t>Default `cc hello.c` requires the exact lower-case final `.c`, removes only that suffix, and appends `.obj`; the derived name must fit the exact 10-byte ZX-UX namespace limit. Otherwise the explicit form is `cc -o out.obj source`, with an exact case-sensitive &lt;=10-byte destination. In both forms, source and destination paths obey the following ZX-UX contract: normalization is performed before comparison or access; the normalized path is at most 31 bytes excluding the terminating NUL; each ordinary object basename is 1..10 portable name characters `A-Z a-z 0-9 _ - .`, with exact `.` and `..` reserved; and lookup is case-sensitive. Overlength normalized paths are rejected through the normal ZX-UX path/errno contract rather than truncated.</w:t>
-      </w:r>
-    </w:p>
-    <w:p>
-      <w:pPr>
-        <w:pStyle w:val="BodyText"/>
-      </w:pPr>
-      <w:r>
-        <w:t>Output is explicitly OBJ/OBJ1; the kernel never infers object type from a suffix.</w:t>
-      </w:r>
-    </w:p>
-    <w:p>
-      <w:pPr>
-        <w:pStyle w:val="BodyText"/>
-      </w:pPr>
-      <w:r>
-        <w:t>Compilation is transactional: `cc` creates a unique O_CREATE|O_EXCL `/tmp/.cc&lt;pid&gt;.&lt;n&gt;` temporary object, writes and validates the complete OBJ1, closes it, and commits through SYS_RENAME only after success. Syntax, semantic, allocation, output, or rename failure leaves any previous destination byte-identical.</w:t>
-      </w:r>
-    </w:p>
-    <w:p>
-      <w:pPr>
-        <w:pStyle w:val="BodyText"/>
-      </w:pPr>
-      <w:r>
-        <w:t>RAW and transparently PACKED C input objects are compiled through the same ordinary logical read stream. The compiler MUST NOT materialize a second whole uncompressed source merely because the source is PACKED; RAW and PACKED forms of identical logical source MUST produce byte-identical OBJ1.</w:t>
-      </w:r>
-    </w:p>
-    <w:p>
-      <w:pPr>
-        <w:pStyle w:val="BodyText"/>
-      </w:pPr>
-      <w:r>
-        <w:t>For the same logical primary source bytes, same logical include bytes, same frozen built-in-header revision, and same compiler revision, compilation is deterministic: destination path, temporary name, PID, and RAW-versus-PACKED storage form MUST NOT be embedded into generated OBJ1 bytes. Default and explicit-output invocations therefore produce byte-identical OBJ1 when they compile the same logical program.</w:t>
-      </w:r>
-    </w:p>
-    <w:p>
-      <w:pPr>
-        <w:pStyle w:val="BodyText"/>
-      </w:pPr>
-      <w:r>
-        <w:t>Only external-linkage definitions are OBJ1 GLOBAL exports; referenced unresolved externals are GLOBAL imports; file-scope static entities are not GLOBAL exports. All link-visible C names use the exact source identifier spelling as frozen by Section 23.2.</w:t>
-      </w:r>
-    </w:p>
-    <w:p>
-      <w:pPr>
-        <w:pStyle w:val="BodyText"/>
-      </w:pPr>
-      <w:r>
-        <w:t>The grammar permits an empty translation unit and a translation unit containing only declarations. Such a C-typed source is a successful compilation when no other error/resource condition exists. If it contributes no text/data, BSS, symbols, or relocations, `cc` emits the canonical valid empty OBJ1: a 24-byte OBJ1 header with all four content counts/sizes zero, fixed offsets equal to 24, and the architecture-defined CRC fields for an empty body/header. It is a valid object module even though linking it alone as a normal program cannot satisfy crt0's required `main`.</w:t>
-      </w:r>
-    </w:p>
-    <w:p>
-      <w:pPr>
-        <w:pStyle w:val="BodyText"/>
-      </w:pPr>
-      <w:r>
-        <w:t>An ordinary ZX-UX RAM C or local-include object cannot exceed the 32768-byte logical object bound. A native compiler may impose separately documented smaller source/workspace limits to fit its available memory; such limits are resource failures, not modifications of this C48 grammar.</w:t>
+        <w:t>sdk/bin/rcc is the host C48 compiler. By default it compiles and links one C48 translation unit to an SSX1 executable. It is not a resident ZX-UX command named cc.</w:t>
+      </w:r>
+    </w:p>
+    <w:p>
+      <w:pPr>
+        <w:pStyle w:val="BodyText"/>
+      </w:pPr>
+      <w:r>
+        <w:t>For example: sdk/bin/rcc hello.c -o hello.ssx. With -S it emits assembly; with -c it emits an SSO1 object (normally .sso). sdk/bin/ras emits SSO1; sdk/bin/rld links SSO1 and SSA1 to SSX1. Host output paths are not constrained by the historical ten-byte ZX-UX OBJ basename rule.</w:t>
+      </w:r>
+    </w:p>
+    <w:p>
+      <w:pPr>
+        <w:pStyle w:val="BodyText"/>
+      </w:pPr>
+      <w:r>
+        <w:t>The accepted current formats are SSO1 relocatable objects, SSA1 object archives, SSX1 linked executables, and SSB1 compact bytecode inside linked program images. OBJ1, MEX1 and M48O are not ZX-UX v1 target formats.</w:t>
+      </w:r>
+    </w:p>
+    <w:p>
+      <w:pPr>
+        <w:pStyle w:val="BodyText"/>
+      </w:pPr>
+      <w:r>
+        <w:t>sdk/bin/rtap writes a ZX Spectrum .tap or .tzx cassette with an SST1 program record carrying the exact SSX1 bytes; /etc/ldx and the sys ssxload service perform the native load/relocation. Neither the kernel nor the compiler accepts a historical object-format compatibility wrapper.</w:t>
+      </w:r>
+    </w:p>
+    <w:p>
+      <w:pPr>
+        <w:pStyle w:val="BodyText"/>
+      </w:pPr>
+      <w:r>
+        <w:t>Input for the host compiler is canonical C48 text. The emitted SSO1 and SSX1 data must be deterministic for the same source and checked toolchain under stable build conditions; host file packaging details do not change language semantics.</w:t>
+      </w:r>
+    </w:p>
+    <w:p>
+      <w:pPr>
+        <w:pStyle w:val="BodyText"/>
+      </w:pPr>
+      <w:r>
+        <w:t>The current SSX1 header is 20 bytes and records image, BSS, stack, heap, entry offset, relocation count and Fletcher-16 checksum. Relocation and on-tape record rules are exactly SPEC-ELASTIC-R2 Section 6; the compiler must not substitute an obsolete 24-byte object or executable header.</w:t>
+      </w:r>
+    </w:p>
+    <w:p>
+      <w:pPr>
+        <w:pStyle w:val="BodyText"/>
+      </w:pPr>
+      <w:r>
+        <w:t>External-linkage definitions and unresolved references are represented as SSO1 symbols and resolved by sdk/rld with SSA1 runtime members. Static entities are not exported as external globals. Linker-visible symbol spelling is case-sensitive and must preserve source identity.</w:t>
+      </w:r>
+    </w:p>
+    <w:p>
+      <w:pPr>
+        <w:pStyle w:val="BodyText"/>
+      </w:pPr>
+      <w:r>
+        <w:t>An empty translation unit is syntactically valid. In -c mode it may produce a valid SSO1 module without user code; linking an executable without an entry-point main is a link error. This specification does not define a historical empty-object encoding.</w:t>
+      </w:r>
+    </w:p>
+    <w:p>
+      <w:pPr>
+        <w:pStyle w:val="BodyText"/>
+      </w:pPr>
+      <w:r>
+        <w:t>Native execution must fit the actual 48K process allocation: image, BSS, heap, stack, arguments and other loader requirements. SSB1 may reduce size but does not waive the memory cap. Compilation alone is not proof that the resulting program loads or runs.</w:t>
       </w:r>
     </w:p>
     <w:p/>
@@ -9315,7 +9282,7 @@
         <w:pStyle w:val="Heading1"/>
       </w:pPr>
       <w:r>
-        <w:t>80. Diagnostics</w:t>
+        <w:t>80. Diagnostics and failures</w:t>
       </w:r>
     </w:p>
     <w:p>
@@ -9325,79 +9292,79 @@
       <w:bookmarkStart w:id="82" w:name="no-undefined-compiler-extensions"/>
       <w:bookmarkEnd w:id="81"/>
       <w:r>
-        <w:t>Acceptance/rejection, compiler process status, diagnostic channel, diagnostic class spelling, and position convention are normative. Free-form reason prose after the frozen class prefix is not.</w:t>
-      </w:r>
-    </w:p>
-    <w:p>
-      <w:pPr>
-        <w:pStyle w:val="BodyText"/>
-      </w:pPr>
-      <w:r>
-        <w:t>`cc` stops after the first terminal compilation/tool error. Success exits with process status 0. A source-language/compiler error with no more specific ZX-UX errno exits with status 1. A terminal direct ZX-UX service failure exits with that positive errno value. Cleanup remains mandatory and MUST NOT replace the original terminal status/cause.</w:t>
-      </w:r>
-    </w:p>
-    <w:p>
-      <w:pPr>
-        <w:pStyle w:val="BodyText"/>
-      </w:pPr>
-      <w:r>
-        <w:t>The exact Version-1 diagnostic classes are: `usage`, `lexical`, `unsupported`, `preprocessing`, `syntax`, `type`, `declaration`, `constant-expression`, `literal-range`, `resource-limit`, and `io`. No other native `cc` class spelling is permitted in Version 1.</w:t>
-      </w:r>
-    </w:p>
-    <w:p>
-      <w:pPr>
-        <w:pStyle w:val="BodyText"/>
-      </w:pPr>
-      <w:r>
-        <w:t>Class mapping is exact: command-shape/default-suffix/same-input-output validation -&gt; `usage`; malformed source bytes/tokens/comments/literals -&gt; `lexical` except a numerically well-formed but out-of-range literal -&gt; `literal-range`; recognized unsupported source keywords/operators -&gt; `unsupported`; malformed/unsupported/nested/include-type/macro-rule violations detected by the C48 preprocessor itself -&gt; `preprocessing`; grammar failures -&gt; `syntax`; operand/type/object-type incompatibility -&gt; `type`; redeclaration/prototype/linkage/`main` entity failures -&gt; `declaration`; invalid pure constant evaluation including constant divide-by-zero or ROM-rejected constant numeric evaluation -&gt; `constant-expression`; bounded compiler table/source/workspace capacity exhaustion not caused by a direct ZX-UX service errno -&gt; `resource-limit`; and terminal direct ZX-UX path/open/stat/read/write/create/close/remove/rename/allocation or other service failures -&gt; `io`.</w:t>
-      </w:r>
-    </w:p>
-    <w:p>
-      <w:pPr>
-        <w:pStyle w:val="BodyText"/>
-      </w:pPr>
-      <w:r>
-        <w:t>For a quoted include, lexical/name/nesting/wrong-object-type rules owned by Sections 73-75 are `preprocessing` errors with compiler status 1. If a syntactically valid include request instead fails because the named object is absent or a direct ZX-UX namespace/open/read service returns an errno, the class is `io`, the positioned diagnostic is anchored at the include operand, and process status is that positive errno. A direct E_NOMEM allocation failure likewise retains class `io`/status E_NOMEM; exhausting a frozen compiler table or source/workspace ceiling without such a service errno is `resource-limit`/status 1.</w:t>
-      </w:r>
-    </w:p>
-    <w:p>
-      <w:pPr>
-        <w:pStyle w:val="BodyText"/>
-      </w:pPr>
-      <w:r>
-        <w:t>Every positioned compile diagnostic identifies the logical source object in which the offending source bytes originated. For the primary input, `&lt;source&gt;` is its resolved normalized ZX-UX path. For a quoted local include, `&lt;source&gt;` is that included object's resolved normalized path. A macro expansion failure is anchored at the first byte of the macro invocation token and names that macro in the reason; an implementation MAY additionally mention its definition location.</w:t>
-      </w:r>
-    </w:p>
-    <w:p>
-      <w:pPr>
-        <w:pStyle w:val="BodyText"/>
-      </w:pPr>
-      <w:r>
-        <w:t>Diagnostic positions are 1-based physical byte coordinates. Line 1 is the first physical line. Column 1 is the first source byte on that line; TAB counts as one byte, not rendered width, and LF is not part of the preceding line's column count. For an existing offending token/construct, the coordinate is the first source byte of that token/construct. A missing required token at line end/end-of-file uses the current one-past-last-byte column; an empty file begins at line 1, column 1.</w:t>
-      </w:r>
-    </w:p>
-    <w:p>
-      <w:pPr>
-        <w:pStyle w:val="BodyText"/>
-      </w:pPr>
-      <w:r>
-        <w:t>The stable positioned prefix is `cc: &lt;source&gt;:&lt;line&gt;:&lt;column&gt;: &lt;class&gt;:` followed by concise implementation wording. Tool/usage failures with no source coordinate use `cc: &lt;class&gt;:`. Native `cc` writes all usage/error diagnostics to stderr handle 2, never stdout handle 1. Successful compilation is silent on both handles.</w:t>
-      </w:r>
-    </w:p>
-    <w:p>
-      <w:pPr>
-        <w:pStyle w:val="BodyText"/>
-      </w:pPr>
-      <w:r>
-        <w:t>C48 Version-1 native `cc` has no nonfatal warning class. Host development tooling MAY provide advisory warnings outside strict native diagnostic conformance, but those warnings MUST NOT change strict C48 acceptance/rejection.</w:t>
-      </w:r>
-    </w:p>
-    <w:p>
-      <w:pPr>
-        <w:pStyle w:val="BodyText"/>
-      </w:pPr>
-      <w:r>
-        <w:t>Failure while attempting to write a diagnostic MUST NOT replace the original compile/tool status, commit output, or convert failure to success. Cleanup still follows the original terminal cause.</w:t>
+        <w:t>Source-language errors, target-format errors and resource failures MUST be detectable. The host compiler reports diagnostics on stderr and returns a nonzero process status for a terminal compilation error.</w:t>
+      </w:r>
+    </w:p>
+    <w:p>
+      <w:pPr>
+        <w:pStyle w:val="BodyText"/>
+      </w:pPr>
+      <w:r>
+        <w:t>sdk/rcc uses process status 0 on successful compilation, 1 on C48 or linker errors, 2 for invalid command use, and 3 for internal assembler errors under the current driver implementation. Invalid outputs must not be represented as successful builds.</w:t>
+      </w:r>
+    </w:p>
+    <w:p>
+      <w:pPr>
+        <w:pStyle w:val="BodyText"/>
+      </w:pPr>
+      <w:r>
+        <w:t>Diagnostic reason wording and class prefixes from the historical resident cc compiler are not the current rcc command ABI. Source-language conformance still requires distinctions among lexical, preprocessing, syntax, type, declaration, literal, constant-expression and resource failures where relevant.</w:t>
+      </w:r>
+    </w:p>
+    <w:p>
+      <w:pPr>
+        <w:pStyle w:val="BodyText"/>
+      </w:pPr>
+      <w:r>
+        <w:t>Unsupported C48 features must be rejected, not silently accepted by host-C translation. Program-type and linking errors are reported by the appropriate compiler/linker stage. An exact historical errno-to-diagnostic-class mapping is not part of the current host interface.</w:t>
+      </w:r>
+    </w:p>
+    <w:p>
+      <w:pPr>
+        <w:pStyle w:val="BodyText"/>
+      </w:pPr>
+      <w:r>
+        <w:t>Local include failures are host source/preprocessing diagnostics rather than old target namespace object-type errors. Target-runtime I/O failures use the library/kernel return conventions actually documented for the current release.</w:t>
+      </w:r>
+    </w:p>
+    <w:p>
+      <w:pPr>
+        <w:pStyle w:val="BodyText"/>
+      </w:pPr>
+      <w:r>
+        <w:t>A located source diagnostic should identify the host source file and offending position. It must not require the historical short ZX-UX object pathname syntax.</w:t>
+      </w:r>
+    </w:p>
+    <w:p>
+      <w:pPr>
+        <w:pStyle w:val="BodyText"/>
+      </w:pPr>
+      <w:r>
+        <w:t>Error source coordinates, when supplied, are source-line positions; tests must establish any claimed exact byte-column contract for the current lexer. Historical native-cc position rules are not silently inherited.</w:t>
+      </w:r>
+    </w:p>
+    <w:p>
+      <w:pPr>
+        <w:pStyle w:val="BodyText"/>
+      </w:pPr>
+      <w:r>
+        <w:t>The current command emits error text prefixed by rcc: on stderr. The legacy cc: path:line:column:class: prefix is not required. Successful compilation may produce no diagnostic output.</w:t>
+      </w:r>
+    </w:p>
+    <w:p>
+      <w:pPr>
+        <w:pStyle w:val="BodyText"/>
+      </w:pPr>
+      <w:r>
+        <w:t>Native resident cc warnings/status conventions are not part of this v1 host toolchain. Any advisory host message must not silently change required C48 source acceptance or rejection.</w:t>
+      </w:r>
+    </w:p>
+    <w:p>
+      <w:pPr>
+        <w:pStyle w:val="BodyText"/>
+      </w:pPr>
+      <w:r>
+        <w:t>Failure to write a diagnostic must not cause the host compiler to claim compilation succeeded. Output integrity and cleanup behavior should be tested rather than assuming the retired native-cc transaction design.</w:t>
       </w:r>
     </w:p>
     <w:p/>
@@ -9441,7 +9408,7 @@
         <w:pStyle w:val="BodyText"/>
       </w:pPr>
       <w:r>
-        <w:t>There is no permissive mode in the native Version-1 compiler.</w:t>
+        <w:t>C48 strict-language conformance has no permissive source-language extension mode. Native versus bytecode selection is a target representation choice, not a language extension.</w:t>
       </w:r>
     </w:p>
     <w:p>
@@ -9779,7 +9746,7 @@
         </w:numPr>
       </w:pPr>
       <w:r>
-        <w:t>compliance with the native compiler release's documented resource capacities;</w:t>
+        <w:t>observance of documented current host-compiler and 48K target memory limits;</w:t>
       </w:r>
     </w:p>
     <w:p>
@@ -9791,24 +9758,21 @@
         </w:numPr>
       </w:pPr>
       <w:r>
-        <w:t xml:space="preserve">use only of </w:t>
-      </w:r>
-      <w:r>
-        <w:rPr>
-          <w:rStyle w:val="VerbatimChar"/>
-        </w:rPr>
-        <w:t>&lt;c48.h&gt;</w:t>
-      </w:r>
-      <w:r>
-        <w:t xml:space="preserve"> APIs whose signatures are frozen for the corresponding ZX-UX release.</w:t>
-      </w:r>
-    </w:p>
-    <w:p>
-      <w:pPr>
-        <w:pStyle w:val="FirstParagraph"/>
-      </w:pPr>
-      <w:r>
-        <w:t>If all conditions pass, the same source text, after canonical LF representation is ensured, is intended to compile on the native ZX-UX C48 compiler without source modification.</w:t>
+        <w:t>use only of &lt;c48.h&gt; APIs implemented in the verified current ZX-UX runtime;</w:t>
+      </w:r>
+      <w:r>
+        <w:rPr>
+          <w:rStyle w:val="VerbatimChar"/>
+        </w:rPr>
+      </w:r>
+      <w:r/>
+    </w:p>
+    <w:p>
+      <w:pPr>
+        <w:pStyle w:val="FirstParagraph"/>
+      </w:pPr>
+      <w:r>
+        <w:t>If those conditions pass, the same canonical source can be compiled by the current sdk/rcc host toolchain and is eligible for testing on ZX-UX. Actual runtime compatibility requires native execution verification.</w:t>
       </w:r>
     </w:p>
     <w:p/>
@@ -9827,7 +9791,7 @@
         <w:pStyle w:val="FirstParagraph"/>
       </w:pPr>
       <w:r>
-        <w:t>C48 compiler tests MUST include at minimum positive lexical examples covering:</w:t>
+        <w:t>The conformance suite for the current host compiler MUST include at least the following positive examples:</w:t>
       </w:r>
     </w:p>
     <w:p>
@@ -10794,7 +10758,7 @@
         <w:pStyle w:val="BodyText"/>
       </w:pPr>
       <w:r>
-        <w:t>Include tests MUST cover local TXT/C RAW/PACKED logical source, current-directory/case/name validation, exact one local level, locally included `&lt;c48.h&gt;`, second quoted-level/include-cycle rejection, built-in header repetition, user/header compatible declaration coexistence, incompatible declaration collision, macro/header-name collision, and rejection of every unsupported directive/header/trailing-token form. Macro tests MUST prove backward-only already-defined dependencies, self/forward-reference rejection, and the impossibility of an accepted expansion cycle.</w:t>
+        <w:t>Include tests MUST cover local host text files, case-sensitive lookup, expected include nesting, valid built-in &lt;c48.h&gt; use, rejection of unsupported headers/directives, declaration collisions and invalid trailing tokens. Macro tests MUST exercise backward-only defined dependencies, rejected forward references, and absence of accepted expansion cycles.</w:t>
       </w:r>
     </w:p>
     <w:p/>
@@ -10970,17 +10934,14 @@
         </w:numPr>
       </w:pPr>
       <w:r>
-        <w:t xml:space="preserve">native </w:t>
-      </w:r>
-      <w:r>
-        <w:rPr>
-          <w:rStyle w:val="VerbatimChar"/>
-        </w:rPr>
-        <w:t>cc</w:t>
-      </w:r>
-      <w:r>
-        <w:t>;</w:t>
-      </w:r>
+        <w:t>current sdk/rcc host compiler and linked SSX1/SSB1 runtime;</w:t>
+      </w:r>
+      <w:r>
+        <w:rPr>
+          <w:rStyle w:val="VerbatimChar"/>
+        </w:rPr>
+      </w:r>
+      <w:r/>
     </w:p>
     <w:p>
       <w:pPr>
@@ -10991,7 +10952,7 @@
         </w:numPr>
       </w:pPr>
       <w:r>
-        <w:t>Windows C48 implementation.</w:t>
+        <w:t>independent host C48 reference implementation.</w:t>
       </w:r>
     </w:p>
     <w:p>
@@ -11018,39 +10979,39 @@
         <w:pStyle w:val="FirstParagraph"/>
       </w:pPr>
       <w:r>
-        <w:t>This document defines the complete C48 Version-1 language grammar and semantics.</w:t>
-      </w:r>
-    </w:p>
-    <w:p>
-      <w:pPr>
-        <w:pStyle w:val="BodyText"/>
-      </w:pPr>
-      <w:r>
-        <w:t>Compiler table capacities and storage budgets are implementation resource limits, not additional C48 syntax rules.</w:t>
-      </w:r>
-    </w:p>
-    <w:p>
-      <w:pPr>
-        <w:pStyle w:val="BodyText"/>
-      </w:pPr>
-      <w:r>
-        <w:t>A compiler MUST NOT invent arbitrary language restrictions merely to simplify memory management.</w:t>
-      </w:r>
-    </w:p>
-    <w:p>
-      <w:pPr>
-        <w:pStyle w:val="BodyText"/>
-      </w:pPr>
-      <w:r>
-        <w:t>Resource limits MUST NOT broaden or narrow the C48 grammar.</w:t>
-      </w:r>
-    </w:p>
-    <w:p>
-      <w:pPr>
-        <w:pStyle w:val="BodyText"/>
-      </w:pPr>
-      <w:r>
-        <w:t>A host checker claiming portability to a particular native compiler release MUST enforce that release's published resource limits independently of language conformance.</w:t>
+        <w:t>This document owns C48 source-language semantics.</w:t>
+      </w:r>
+    </w:p>
+    <w:p>
+      <w:pPr>
+        <w:pStyle w:val="BodyText"/>
+      </w:pPr>
+      <w:r>
+        <w:t>SPEC-SDK-R2 and SPEC-ELASTIC-R2 own the current compiler ABI, object/executable/tape formats and 48K resource limits.</w:t>
+      </w:r>
+    </w:p>
+    <w:p>
+      <w:pPr>
+        <w:pStyle w:val="BodyText"/>
+      </w:pPr>
+      <w:r>
+        <w:t>Compiler implementation choices MUST NOT introduce arbitrary grammar restrictions merely to simplify memory management.</w:t>
+      </w:r>
+    </w:p>
+    <w:p>
+      <w:pPr>
+        <w:pStyle w:val="BodyText"/>
+      </w:pPr>
+      <w:r>
+        <w:t>The current backend MUST NOT broaden the language while selecting native or SSB1 output.</w:t>
+      </w:r>
+    </w:p>
+    <w:p>
+      <w:pPr>
+        <w:pStyle w:val="BodyText"/>
+      </w:pPr>
+      <w:r>
+        <w:t>Real implementation capacities are tested and documented for portable programs; they do not rewrite the grammar.</w:t>
       </w:r>
     </w:p>
     <w:p/>
@@ -11068,32 +11029,34 @@
       <w:pPr>
         <w:pStyle w:val="FirstParagraph"/>
       </w:pPr>
-      <w:r>
-        <w:t>This specification defines C48 tokens, grammar, preprocessing, types, declarations, expressions, statements, conversions, evaluation semantics, and the supported or forbidden language surface.</w:t>
-      </w:r>
-    </w:p>
-    <w:p>
-      <w:pPr>
-        <w:pStyle w:val="BodyText"/>
-      </w:pPr>
-      <w:r>
-        <w:t>Runtime service ABI behavior and public header signatures are target-interface details. Appendix B lists mandatory public names; where an exact prototype, parameter type, constant value, or supporting record is absent from this specification, it MUST NOT be guessed, and no new C48 syntax may be introduced to express it.</w:t>
-      </w:r>
-    </w:p>
-    <w:p>
-      <w:pPr>
-        <w:pStyle w:val="BodyText"/>
-      </w:pPr>
-      <w:r>
-        <w:t>The public C48 function `beep` has the exact declaration `int beep(float duration, float pitch)`.</w:t>
-      </w:r>
-    </w:p>
-    <w:p>
-      <w:pPr>
-        <w:pStyle w:val="BodyText"/>
-      </w:pPr>
-      <w:r>
-        <w:t>The following is explanatory floating bridge notation only, not a valid C48 prototype:</w:t>
+      <w:bookmarkStart w:id="98" w:name="important-const-distinction"/>
+      <w:bookmarkEnd w:id="97"/>
+      <w:r>
+        <w:t>This document owns source tokens, grammar, preprocessing semantics, types, conversions, expressions and statements. The current SDK and kernel documents own runtime, API and binary ABI implementation details.</w:t>
+      </w:r>
+    </w:p>
+    <w:p>
+      <w:pPr>
+        <w:pStyle w:val="BodyText"/>
+      </w:pPr>
+      <w:r>
+        <w:t>sdk/include/c48.h owns the public C48 prototypes and sdk/lib/libc48.ssa supplies linked runtime functions. Unimplemented historical services are not silently promised as v1 APIs.</w:t>
+      </w:r>
+    </w:p>
+    <w:p>
+      <w:pPr>
+        <w:pStyle w:val="BodyText"/>
+      </w:pPr>
+      <w:r>
+        <w:t>The current header declares int beep(float duration, float pitch), with the ROM-compatible numeric behavior implemented in the SDK runtime.</w:t>
+      </w:r>
+    </w:p>
+    <w:p>
+      <w:pPr>
+        <w:pStyle w:val="BodyText"/>
+      </w:pPr>
+      <w:r>
+        <w:t>Historical pseudocode can contain modern C-like type spellings that are not C48 source syntax; such pseudocode is not a v1 exported function.</w:t>
       </w:r>
     </w:p>
     <w:p>
@@ -11101,15 +11064,15 @@
         <w:pStyle w:val="SourceCode"/>
       </w:pPr>
       <w:r>
-        <w:t>int zx_fp_exec(op, const float *lhs, const float *rhs, float *out)</w:t>
-      </w:r>
-    </w:p>
-    <w:p>
-      <w:pPr>
-        <w:pStyle w:val="FirstParagraph"/>
-      </w:pPr>
-      <w:r>
-        <w:t>That notation is not valid C48 source: `op` has no stated C48 type and `const` is unsupported. Any actual source-facing declaration MUST use only the language syntax defined here and the target runtime's independently verified ABI. This notation MUST NOT be copied into `&lt;c48.h&gt;` or used to extend C48.</w:t>
+        <w:t>Example only: const float *buffer (not valid C48 source syntax).</w:t>
+      </w:r>
+    </w:p>
+    <w:p>
+      <w:pPr>
+        <w:pStyle w:val="FirstParagraph"/>
+      </w:pPr>
+      <w:r>
+        <w:t>The word const remains a reserved-but-unsupported C48 type modifier. Public declarations are those in sdk/include/c48.h, not inferred older architecture pseudocode.</w:t>
       </w:r>
     </w:p>
     <w:p/>
@@ -11134,16 +11097,18 @@
       <w:pPr>
         <w:pStyle w:val="FirstParagraph"/>
       </w:pPr>
-      <w:r>
-        <w:t>Read-only floating buffers may be described in explanatory ABI notation using `const float *`. C48 Version 1 itself does not support the `const` type modifier.</w:t>
-      </w:r>
-    </w:p>
-    <w:p>
-      <w:pPr>
-        <w:pStyle w:val="BodyText"/>
-      </w:pPr>
-      <w:r>
-        <w:t>Only the C48 source syntax in this document is valid for built-in declarations.</w:t>
+      <w:bookmarkStart w:id="99" w:name="no-silent-architecture-extrapolation"/>
+      <w:bookmarkEnd w:id="98"/>
+      <w:r>
+        <w:t>Illustrative assembly/host interfaces may use modern-C const notation to describe read-only data. C48 Rev 0.11 itself does not accept const as a source type modifier.</w:t>
+      </w:r>
+    </w:p>
+    <w:p>
+      <w:pPr>
+        <w:pStyle w:val="BodyText"/>
+      </w:pPr>
+      <w:r>
+        <w:t>The compiler MUST NOT acquire unsupported const semantics merely by importing a host header; only C48-compatible prototypes in sdk/include/c48.h form the current public runtime API.</w:t>
       </w:r>
     </w:p>
     <w:p>
@@ -11160,23 +11125,71 @@
         <w:pStyle w:val="Heading1"/>
       </w:pPr>
       <w:r>
-        <w:t>98. No silent contract invention</w:t>
-      </w:r>
-    </w:p>
-    <w:p>
-      <w:pPr>
-        <w:pStyle w:val="FirstParagraph"/>
-      </w:pPr>
-      <w:r>
-        <w:t>If a language or compiler behavior cannot be determined from the normative rules of this specification and its appendices, the implementer MUST identify the unresolved contract and stop that portion of the implementation.</w:t>
-      </w:r>
-    </w:p>
-    <w:p>
-      <w:pPr>
-        <w:pStyle w:val="FirstParagraph"/>
-      </w:pPr>
-      <w:r>
-        <w:t>A target-specific runtime or OS integration detail not defined here MUST likewise be marked unresolved; it MUST NOT be used to invent a C48 language rule.</w:t>
+        <w:t>98. No silent architecture extrapolation</w:t>
+      </w:r>
+    </w:p>
+    <w:p>
+      <w:pPr>
+        <w:pStyle w:val="FirstParagraph"/>
+      </w:pPr>
+      <w:r>
+        <w:t>If an implementation question is not answered by:</w:t>
+      </w:r>
+    </w:p>
+    <w:p>
+      <w:pPr>
+        <w:pStyle w:val="Compact"/>
+        <w:numPr>
+          <w:ilvl w:val="0"/>
+          <w:numId w:val="42"/>
+        </w:numPr>
+      </w:pPr>
+      <w:r>
+        <w:t>this C48 language specification;</w:t>
+      </w:r>
+    </w:p>
+    <w:p>
+      <w:pPr>
+        <w:pStyle w:val="Compact"/>
+        <w:numPr>
+          <w:ilvl w:val="0"/>
+          <w:numId w:val="42"/>
+        </w:numPr>
+      </w:pPr>
+      <w:r>
+        <w:t>docs/SPEC-SDK-R2.md and docs/SPEC-ELASTIC-R2.md;</w:t>
+      </w:r>
+    </w:p>
+    <w:p>
+      <w:pPr>
+        <w:pStyle w:val="Compact"/>
+        <w:numPr>
+          <w:ilvl w:val="0"/>
+          <w:numId w:val="42"/>
+        </w:numPr>
+      </w:pPr>
+      <w:r>
+        <w:t>the checked current SDK, runtime or kernel interfaces;</w:t>
+      </w:r>
+    </w:p>
+    <w:p>
+      <w:pPr>
+        <w:pStyle w:val="Compact"/>
+        <w:numPr>
+          <w:ilvl w:val="0"/>
+          <w:numId w:val="42"/>
+        </w:numPr>
+      </w:pPr>
+      <w:r>
+        <w:t>an approved conformance test tied to an explicit requirement;</w:t>
+      </w:r>
+    </w:p>
+    <w:p>
+      <w:pPr>
+        <w:pStyle w:val="FirstParagraph"/>
+      </w:pPr>
+      <w:r>
+        <w:t>the developer MUST stop that portion of implementation and record the unresolved contract.</w:t>
       </w:r>
     </w:p>
     <w:p>
@@ -11219,7 +11232,7 @@
         <w:pStyle w:val="FirstParagraph"/>
       </w:pPr>
       <w:r>
-        <w:t>A Windows C48 implementation and the native ZX-UX C48 implementation are functionally language-equivalent when, for every canonical source within frozen implementation resource limits:</w:t>
+        <w:t>A C48 host implementation and execution of a program compiled by the current sdk/rcc are language-equivalent only when the same canonical source and deterministic inputs produce identical defined C48 behavior within the ZX-UX target resource limits:</w:t>
       </w:r>
     </w:p>
     <w:p>
@@ -11374,7 +11387,7 @@
         <w:pStyle w:val="FirstParagraph"/>
       </w:pPr>
       <w:r>
-        <w:t>This is the foundation for writing C48 software on Windows and transferring the source unchanged to ZX-UX.</w:t>
+        <w:t>Byte-identical binary output is not required between distinct compiler implementations; portable C48 requires identical defined semantics. Native execution must be proved separately.</w:t>
       </w:r>
     </w:p>
     <w:p/>
@@ -11382,24 +11395,28 @@
       <w:pPr>
         <w:pStyle w:val="Heading1"/>
       </w:pPr>
-      <w:r>
-        <w:t>100. Specification completeness rule</w:t>
-      </w:r>
-    </w:p>
-    <w:p>
-      <w:pPr>
-        <w:pStyle w:val="FirstParagraph"/>
-      </w:pPr>
-      <w:r>
-        <w:t>The C48 Version-1 specification is not complete merely because it lists the supported C keywords.</w:t>
-      </w:r>
-    </w:p>
-    <w:p>
-      <w:pPr>
-        <w:pStyle w:val="BodyText"/>
-      </w:pPr>
-      <w:r>
-        <w:t>This document freezes, at minimum:</w:t>
+      <w:bookmarkStart w:id="101" w:name="p11.01-completion-rule"/>
+      <w:bookmarkEnd w:id="100"/>
+      <w:r>
+        <w:t>100. Current v1 conformance coverage requirement</w:t>
+      </w:r>
+    </w:p>
+    <w:p>
+      <w:pPr>
+        <w:pStyle w:val="FirstParagraph"/>
+      </w:pPr>
+      <w:bookmarkStart w:id="102" w:name="p11.01-forensic-pass-condition"/>
+      <w:bookmarkEnd w:id="101"/>
+      <w:r>
+        <w:t>The specification is not proven complete by a supported-keyword list or by successful compilation alone. Required language rules must be mapped to automated semantic and negative tests.</w:t>
+      </w:r>
+    </w:p>
+    <w:p>
+      <w:pPr>
+        <w:pStyle w:val="BodyText"/>
+      </w:pPr>
+      <w:r>
+        <w:t>The completed c48.md must freeze, at minimum:</w:t>
       </w:r>
     </w:p>
     <w:p>
@@ -11463,7 +11480,7 @@
         <w:pStyle w:val="Compact"/>
       </w:pPr>
       <w:r>
-        <w:t>declarator restrictions, declarations, storage classes, scope, linkage, definitions, and OBJ1 symbol spelling;</w:t>
+        <w:t>declarator restrictions, declarations, storage classes, scope, linkage, definitions and SSO1 external-symbol behavior;</w:t>
       </w:r>
     </w:p>
     <w:p>
@@ -11543,15 +11560,15 @@
         <w:pStyle w:val="Compact"/>
       </w:pPr>
       <w:r>
-        <w:t>compiler command input/output/transaction/determinism/status/diagnostic contract;</w:t>
-      </w:r>
-    </w:p>
-    <w:p>
-      <w:pPr>
-        <w:pStyle w:val="Compact"/>
-      </w:pPr>
-      <w:r>
-        <w:t>the distinction between language semantics, compiler resource limits, and target runtime API details;</w:t>
+        <w:t>host rcc invocation, diagnostic/nonzero-status behavior, SSO1/SSA1/SSX1/SSB1 and SST1 output checks;</w:t>
+      </w:r>
+    </w:p>
+    <w:p>
+      <w:pPr>
+        <w:pStyle w:val="Compact"/>
+      </w:pPr>
+      <w:r>
+        <w:t>documented 48K memory limits and actual runtime-library/header availability;</w:t>
       </w:r>
     </w:p>
     <w:p>
@@ -11567,7 +11584,7 @@
         <w:pStyle w:val="FirstParagraph"/>
       </w:pPr>
       <w:r>
-        <w:t>No item above may be left to language-implementation inference. Internal code generation may use any method that preserves the exact semantics and ABI-visible requirements stated in this document.</w:t>
+        <w:t>No language rule may be left to unchecked implementation inference. Target ABI choices follow the current checked architecture, not retired native-compiler implementation plans.</w:t>
       </w:r>
     </w:p>
     <w:p/>
@@ -11576,23 +11593,25 @@
         <w:pStyle w:val="Heading1"/>
       </w:pPr>
       <w:r>
-        <w:t>101. Standalone conformance verification</w:t>
-      </w:r>
-    </w:p>
-    <w:p>
-      <w:pPr>
-        <w:pStyle w:val="FirstParagraph"/>
-      </w:pPr>
-      <w:r>
-        <w:t>Validation requires three consecutive full reviews of this specification with no new findings or internal contradictions. The existence of this text alone does not establish compiler conformance.</w:t>
-      </w:r>
-    </w:p>
-    <w:p>
-      <w:pPr>
-        <w:pStyle w:val="BodyText"/>
-      </w:pPr>
-      <w:r>
-        <w:t>Each fresh scan MUST independently cover the normative rules in this document and at least the following dimensions:</w:t>
+        <w:t>101. ZX-UX v1 verification</w:t>
+      </w:r>
+    </w:p>
+    <w:p>
+      <w:pPr>
+        <w:pStyle w:val="FirstParagraph"/>
+      </w:pPr>
+      <w:bookmarkStart w:id="103" w:name="frozen-version-1-language-summary"/>
+      <w:bookmarkEnd w:id="102"/>
+      <w:r>
+        <w:t>Run fresh language, format, and runtime tests on the current SDK implementation. Previous results do not replace required new tests.</w:t>
+      </w:r>
+    </w:p>
+    <w:p>
+      <w:pPr>
+        <w:pStyle w:val="BodyText"/>
+      </w:pPr>
+      <w:r>
+        <w:t>The required scans and tests cover the language and the actual ZX-UX v1 toolchain and must include:</w:t>
       </w:r>
     </w:p>
     <w:p>
@@ -11600,43 +11619,30 @@
         <w:pStyle w:val="SourceCode"/>
       </w:pPr>
       <w:r>
-        <w:t>zero contradictions among the normative C48 rules in this specification</w:t>
-        <w:br/>
-        <w:t>zero supported C48 language features omitted</w:t>
-        <w:br/>
-        <w:t>zero unsupported language features accidentally enabled</w:t>
-        <w:br/>
-        <w:t>zero lexical categories left implementation-defined</w:t>
-        <w:br/>
-        <w:t>zero maximal-munch/token-boundary gaps</w:t>
-        <w:br/>
-        <w:t>zero grammar productions left to parser invention</w:t>
-        <w:br/>
-        <w:t>zero operator precedence/associativity gaps</w:t>
-        <w:br/>
-        <w:t>zero scalar conversion/type-result gaps</w:t>
-        <w:br/>
-        <w:t>zero shift-width or integer-literal contradictions</w:t>
-        <w:br/>
-        <w:t>zero pointer/indexing/type-construction gaps</w:t>
-        <w:br/>
-        <w:t>zero statement/control-flow gaps</w:t>
-        <w:br/>
-        <w:t>zero preprocessing behavior gaps</w:t>
-        <w:br/>
-        <w:t>zero host/native semantic differences left to host C</w:t>
-        <w:br/>
-        <w:t>zero undocumented language extensions</w:t>
-        <w:br/>
-        <w:t>zero unrecorded gaps in the compiler resource/runtime interface boundary</w:t>
-      </w:r>
-    </w:p>
-    <w:p>
-      <w:pPr>
-        <w:pStyle w:val="FirstParagraph"/>
-      </w:pPr>
-      <w:r>
-        <w:t>Any new finding resets the consecutive-clean-pass count to zero after the documents are repaired and written to disk.</w:t>
+        <w:t>C48 source tests; SSO1 and SSA1 checks; SSX1 and SSB1 checks; SST1 tape checks; ZX-UX loader checks; authentic display comparisons; fresh FUSE boot; approved final scans.</w:t>
+      </w:r>
+      <w:r/>
+      <w:r/>
+      <w:r/>
+      <w:r/>
+      <w:r/>
+      <w:r/>
+      <w:r/>
+      <w:r/>
+      <w:r/>
+      <w:r/>
+      <w:r/>
+      <w:r/>
+      <w:r/>
+      <w:r/>
+      <w:r/>
+    </w:p>
+    <w:p>
+      <w:pPr>
+        <w:pStyle w:val="FirstParagraph"/>
+      </w:pPr>
+      <w:r>
+        <w:t>Any new failure must be recorded, diagnosed and fixed or explicitly classified as inconclusive; required failures block release.</w:t>
       </w:r>
     </w:p>
     <w:p/>
@@ -12043,7 +12049,7 @@
         <w:pStyle w:val="BodyText"/>
       </w:pPr>
       <w:r>
-        <w:t>C48 shifts retain the unpromoted left operand width: 8-bit operands use the low 3 bits of the count, and 16-bit operands use the low 4 bits.</w:t>
+        <w:t>The normal integer-promotion rules are C-like except that C48 shifts deliberately retain the unpromoted left operand width so 8-bit operands use the architecture-required low-3-bit shift count; 16-bit operands use low 4 bits.</w:t>
       </w:r>
     </w:p>
     <w:p/>
@@ -12052,16 +12058,22 @@
         <w:pStyle w:val="Heading1"/>
       </w:pPr>
       <w:r>
-        <w:t>103. Developer directive</w:t>
-      </w:r>
-    </w:p>
-    <w:p>
-      <w:pPr>
-        <w:pStyle w:val="FirstParagraph"/>
-      </w:pPr>
-      <w:r>
-        <w:t>Implementations SHALL use this document and its appendices as the standalone C48 Version-1 language definition. The native ZX-UX compiler and the independent Windows implementation MUST conform to the same language contract.</w:t>
-      </w:r>
+        <w:t>103. ZX-UX v1 developer directive</w:t>
+      </w:r>
+    </w:p>
+    <w:p>
+      <w:pPr>
+        <w:pStyle w:val="FirstParagraph"/>
+      </w:pPr>
+      <w:r>
+        <w:t>Implement the C48 source language under this document while targeting current ZX-UX docs/SPEC-SDK-R2.md and docs/SPEC-ELASTIC-R2.md. Do not import the retired native compiler, object formats, executable formats or old kernel loader.</w:t>
+      </w:r>
+      <w:r>
+        <w:rPr>
+          <w:rStyle w:val="VerbatimChar"/>
+        </w:rPr>
+      </w:r>
+      <w:r/>
     </w:p>
     <w:p>
       <w:pPr>
@@ -12084,15 +12096,15 @@
         <w:pStyle w:val="BodyText"/>
       </w:pPr>
       <w:r>
-        <w:t>The implementer must encode the frozen rules accurately, identify any genuine internal conflict, and refuse to invent unspecified behavior.</w:t>
-      </w:r>
-    </w:p>
-    <w:p>
-      <w:pPr>
-        <w:pStyle w:val="BodyText"/>
-      </w:pPr>
-      <w:r>
-        <w:t>Both conforming implementations:</w:t>
+        <w:t>The developer's task is to encode that frozen language accurately, identify any genuine architecture conflict, and refuse to invent anything that remains unspecified.</w:t>
+      </w:r>
+    </w:p>
+    <w:p>
+      <w:pPr>
+        <w:pStyle w:val="BodyText"/>
+      </w:pPr>
+      <w:r>
+        <w:t>The same language contract applies to:</w:t>
       </w:r>
     </w:p>
     <w:p>
@@ -12103,7 +12115,7 @@
         <w:rPr>
           <w:rStyle w:val="VerbatimChar"/>
         </w:rPr>
-        <w:t>Windows C48</w:t>
+        <w:t>independent C48 host development tools</w:t>
       </w:r>
     </w:p>
     <w:p>
@@ -12122,7 +12134,7 @@
         <w:rPr>
           <w:rStyle w:val="VerbatimChar"/>
         </w:rPr>
-        <w:t>ZX-UX native cc</w:t>
+        <w:t>the current ZX-UX sdk/rcc compiler and SSX1 runtime</w:t>
       </w:r>
     </w:p>
     <w:p>
@@ -12138,7 +12150,7 @@
         <w:pStyle w:val="BodyText"/>
       </w:pPr>
       <w:r>
-        <w:t>Their shared C48 language contract, not either compiler's incidental behavior, establishes source portability.</w:t>
+        <w:t>That common contract, rather than either compiler's incidental behavior, is the controlling reference for source portability.</w:t>
       </w:r>
     </w:p>
     <w:bookmarkEnd w:id="104"/>
@@ -12740,7 +12752,7 @@
         <w:pStyle w:val="FirstParagraph"/>
       </w:pPr>
       <w:r>
-        <w:t>The following names are mandatory `&lt;c48.h&gt;` public-runtime entries. This appendix records the complete required name inventory, not invented signatures; exact declarations absent from this language document must be verified against the implementation before a runtime-API conformance claim.</w:t>
+        <w:t>The current public functions are those declared in the checked sdk/include/c48.h. This inventory records their names; the actual header is authoritative for exact return/parameter types. Missing historical facilities are not v1 promises.</w:t>
       </w:r>
     </w:p>
     <w:p>
@@ -12748,335 +12760,205 @@
         <w:pStyle w:val="SourceCode"/>
       </w:pPr>
       <w:r>
+        <w:t>getchar</w:t>
+        <w:br/>
+        <w:t>putchar</w:t>
+        <w:br/>
+        <w:t>puts</w:t>
+        <w:br/>
+        <w:t>cls</w:t>
+        <w:br/>
+        <w:t>print_at</w:t>
+        <w:br/>
+        <w:t>ink</w:t>
+        <w:br/>
+        <w:t>paper</w:t>
+        <w:br/>
+        <w:t>bright</w:t>
+        <w:br/>
+        <w:t>flash</w:t>
+        <w:br/>
+        <w:t>inverse</w:t>
+        <w:br/>
+        <w:t>over</w:t>
+        <w:br/>
+        <w:t>border</w:t>
+        <w:br/>
+        <w:t>plot</w:t>
+        <w:br/>
+        <w:t>point</w:t>
+        <w:br/>
+        <w:t>draw</w:t>
+        <w:br/>
+        <w:t>circle</w:t>
+        <w:br/>
+        <w:t>udg_define</w:t>
+        <w:br/>
+        <w:t>udg_get</w:t>
+        <w:br/>
+        <w:t>udg_draw</w:t>
+        <w:br/>
+        <w:t>udg_clear</w:t>
+        <w:br/>
+        <w:t>udg_draw_2x2</w:t>
+        <w:br/>
+        <w:t>ticks</w:t>
+        <w:br/>
+        <w:t>yield</w:t>
+        <w:br/>
+        <w:t>sleep</w:t>
+        <w:br/>
+        <w:t>beep</w:t>
+        <w:br/>
         <w:t>exit</w:t>
-      </w:r>
-      <w:r>
-        <w:br/>
-        <w:t>yield</w:t>
-      </w:r>
-      <w:r>
-        <w:br/>
-        <w:t>sleep</w:t>
-      </w:r>
-      <w:r>
-        <w:br/>
-        <w:t>spawn</w:t>
-      </w:r>
-      <w:r>
-        <w:br/>
-        <w:t>wait</w:t>
-      </w:r>
-      <w:r>
-        <w:br/>
-        <w:t>kill</w:t>
-      </w:r>
-      <w:r>
-        <w:br/>
-        <w:t>chdir</w:t>
-      </w:r>
-      <w:r>
-        <w:br/>
-        <w:t>getcwd</w:t>
-      </w:r>
-      <w:r>
-        <w:br/>
-        <w:t>getenv</w:t>
-      </w:r>
-      <w:r>
         <w:br/>
         <w:t>getpid</w:t>
-      </w:r>
-      <w:r>
-        <w:br/>
-      </w:r>
-      <w:r>
+        <w:br/>
+        <w:t>strlen</w:t>
+        <w:br/>
+        <w:t>strcmp</w:t>
+        <w:br/>
+        <w:t>strcpy</w:t>
+        <w:br/>
+        <w:t>strncpy</w:t>
+        <w:br/>
+        <w:t>memcpy</w:t>
+        <w:br/>
+        <w:t>memmove</w:t>
+        <w:br/>
+        <w:t>memchr</w:t>
+        <w:br/>
+        <w:t>memset</w:t>
+        <w:br/>
+        <w:t>malloc</w:t>
+        <w:br/>
+        <w:t>free</w:t>
+        <w:br/>
+        <w:t>sin</w:t>
+        <w:br/>
+        <w:t>cos</w:t>
+        <w:br/>
+        <w:t>tan</w:t>
+        <w:br/>
+        <w:t>asin</w:t>
+        <w:br/>
+        <w:t>acos</w:t>
+        <w:br/>
+        <w:t>atan</w:t>
+        <w:br/>
+        <w:t>sqrt</w:t>
+        <w:br/>
+        <w:t>exp</w:t>
+        <w:br/>
+        <w:t>log</w:t>
+        <w:br/>
+        <w:t>fabs</w:t>
+        <w:br/>
+        <w:t>pow</w:t>
         <w:br/>
         <w:t>open</w:t>
-      </w:r>
-      <w:r>
-        <w:br/>
-        <w:t>open_typed</w:t>
-      </w:r>
-      <w:r>
         <w:br/>
         <w:t>close</w:t>
-      </w:r>
-      <w:r>
         <w:br/>
         <w:t>read</w:t>
-      </w:r>
-      <w:r>
-        <w:br/>
-        <w:t>write</w:t>
-      </w:r>
-      <w:r>
         <w:br/>
         <w:t>seek</w:t>
       </w:r>
-      <w:r>
-        <w:br/>
-        <w:t>stat</w:t>
-      </w:r>
-      <w:r>
-        <w:br/>
-        <w:t>remove</w:t>
-      </w:r>
-      <w:r>
-        <w:br/>
-        <w:t>rename</w:t>
-      </w:r>
-      <w:r>
-        <w:br/>
-        <w:t>list</w:t>
-      </w:r>
-      <w:r>
-        <w:br/>
-        <w:t>pipe</w:t>
-      </w:r>
-      <w:r>
-        <w:br/>
-        <w:t>dup</w:t>
-      </w:r>
-      <w:r>
-        <w:br/>
-        <w:t>ioctl</w:t>
-      </w:r>
-      <w:r>
-        <w:br/>
-        <w:t>read_full</w:t>
-      </w:r>
-      <w:r>
-        <w:br/>
-        <w:t>write_full</w:t>
-      </w:r>
-      <w:r>
-        <w:br/>
-      </w:r>
-      <w:r>
-        <w:br/>
-        <w:t>getchar</w:t>
-      </w:r>
-      <w:r>
-        <w:br/>
-        <w:t>putchar</w:t>
-      </w:r>
-      <w:r>
-        <w:br/>
-        <w:t>puts</w:t>
-      </w:r>
-      <w:r>
-        <w:br/>
-      </w:r>
-      <w:r>
-        <w:br/>
-        <w:t>strlen</w:t>
-      </w:r>
-      <w:r>
-        <w:br/>
-        <w:t>strcmp</w:t>
-      </w:r>
-      <w:r>
-        <w:br/>
-        <w:t>strcpy</w:t>
-      </w:r>
-      <w:r>
-        <w:br/>
-        <w:t>strncpy</w:t>
-      </w:r>
-      <w:r>
-        <w:br/>
-        <w:t>memcpy</w:t>
-      </w:r>
-      <w:r>
-        <w:br/>
-        <w:t>memmove</w:t>
-      </w:r>
-      <w:r>
-        <w:br/>
-        <w:t>memchr</w:t>
-      </w:r>
-      <w:r>
-        <w:br/>
-        <w:t>memset</w:t>
-      </w:r>
-      <w:r>
-        <w:br/>
-      </w:r>
-      <w:r>
-        <w:br/>
-        <w:t>malloc</w:t>
-      </w:r>
-      <w:r>
-        <w:br/>
-        <w:t>free</w:t>
-      </w:r>
-      <w:r>
-        <w:br/>
-      </w:r>
-      <w:r>
-        <w:br/>
-        <w:t>cls</w:t>
-      </w:r>
-      <w:r>
-        <w:br/>
-        <w:t>print_at</w:t>
-      </w:r>
-      <w:r>
-        <w:br/>
-        <w:t>plot</w:t>
-      </w:r>
-      <w:r>
-        <w:br/>
-        <w:t>point</w:t>
-      </w:r>
-      <w:r>
-        <w:br/>
-        <w:t>draw</w:t>
-      </w:r>
-      <w:r>
-        <w:br/>
-        <w:t>circle</w:t>
-      </w:r>
-      <w:r>
-        <w:br/>
-        <w:t>ink</w:t>
-      </w:r>
-      <w:r>
-        <w:br/>
-        <w:t>paper</w:t>
-      </w:r>
-      <w:r>
-        <w:br/>
-        <w:t>bright</w:t>
-      </w:r>
-      <w:r>
-        <w:br/>
-        <w:t>flash</w:t>
-      </w:r>
-      <w:r>
-        <w:br/>
-        <w:t>inverse</w:t>
-      </w:r>
-      <w:r>
-        <w:br/>
-        <w:t>over</w:t>
-      </w:r>
-      <w:r>
-        <w:br/>
-        <w:t>border</w:t>
-      </w:r>
-      <w:r>
-        <w:br/>
-        <w:t>beep</w:t>
-      </w:r>
-      <w:r>
-        <w:br/>
-      </w:r>
-      <w:r>
-        <w:br/>
-        <w:t>udg_define</w:t>
-      </w:r>
-      <w:r>
-        <w:br/>
-        <w:t>udg_get</w:t>
-      </w:r>
-      <w:r>
-        <w:br/>
-        <w:t>udg_draw</w:t>
-      </w:r>
-      <w:r>
-        <w:br/>
-        <w:t>udg_clear</w:t>
-      </w:r>
-      <w:r>
-        <w:br/>
-        <w:t>udg_draw_2x2</w:t>
-      </w:r>
-      <w:r>
-        <w:br/>
-      </w:r>
-      <w:r>
-        <w:br/>
-        <w:t>tape_save</w:t>
-      </w:r>
-      <w:r>
-        <w:br/>
-        <w:t>tape_load</w:t>
-      </w:r>
-      <w:r>
-        <w:br/>
-        <w:t>ticks</w:t>
-      </w:r>
-      <w:r>
-        <w:br/>
-        <w:t>time_get</w:t>
-      </w:r>
-      <w:r>
-        <w:br/>
-        <w:t>time_set</w:t>
-      </w:r>
-      <w:r>
-        <w:br/>
-      </w:r>
-      <w:r>
-        <w:br/>
-        <w:t>sin</w:t>
-      </w:r>
-      <w:r>
-        <w:br/>
-        <w:t>cos</w:t>
-      </w:r>
-      <w:r>
-        <w:br/>
-        <w:t>tan</w:t>
-      </w:r>
-      <w:r>
-        <w:br/>
-        <w:t>asin</w:t>
-      </w:r>
-      <w:r>
-        <w:br/>
-        <w:t>acos</w:t>
-      </w:r>
-      <w:r>
-        <w:br/>
-        <w:t>atan</w:t>
-      </w:r>
-      <w:r>
-        <w:br/>
-        <w:t>sqrt</w:t>
-      </w:r>
-      <w:r>
-        <w:br/>
-        <w:t>exp</w:t>
-      </w:r>
-      <w:r>
-        <w:br/>
-        <w:t>log</w:t>
-      </w:r>
-      <w:r>
-        <w:br/>
-        <w:t>pow</w:t>
-      </w:r>
-      <w:r>
-        <w:br/>
-        <w:t>fabs</w:t>
-      </w:r>
-    </w:p>
-    <w:p>
-      <w:pPr>
-        <w:pStyle w:val="FirstParagraph"/>
-      </w:pPr>
-      <w:r>
-        <w:t>`printf` is not part of the mandatory Version-1 public surface. A compact integer formatter and a small ROM-backed floating formatter are required without imposing a large general-purpose `printf` interface.</w:t>
-      </w:r>
-    </w:p>
-    <w:p>
-      <w:pPr>
-        <w:pStyle w:val="BodyText"/>
-      </w:pPr>
-      <w:r>
-        <w:t>The floating helper names `__fadd`, `__fsub`, `__fmul`, `__fdiv`, `__fpow`, `__fabs`, `__fsgn`, `__fint`, `__fexp`, `__fln`, `__fsin`, `__fcos`, `__ftan`, `__fasin`, `__facos`, `__fatan`, `__fsqrt`, `__itof`, `__ftoi`, and `__fcmp` are implementation-owned runtime symbols, not public C48 header functions. `zx_fp_exec` is internal bridge notation and not a required public `&lt;c48.h&gt;` name in Version 1.</w:t>
+      <w:r/>
+      <w:r/>
+      <w:r/>
+      <w:r/>
+      <w:r/>
+      <w:r/>
+      <w:r/>
+      <w:r/>
+      <w:r/>
+      <w:r/>
+      <w:r/>
+      <w:r/>
+      <w:r/>
+      <w:r/>
+      <w:r/>
+      <w:r/>
+      <w:r/>
+      <w:r/>
+      <w:r/>
+      <w:r/>
+      <w:r/>
+      <w:r/>
+      <w:r/>
+      <w:r/>
+      <w:r/>
+      <w:r/>
+      <w:r/>
+      <w:r/>
+      <w:r/>
+      <w:r/>
+      <w:r/>
+      <w:r/>
+      <w:r/>
+      <w:r/>
+      <w:r/>
+      <w:r/>
+      <w:r/>
+      <w:r/>
+      <w:r/>
+      <w:r/>
+      <w:r/>
+      <w:r/>
+      <w:r/>
+      <w:r/>
+      <w:r/>
+      <w:r/>
+      <w:r/>
+      <w:r/>
+      <w:r/>
+      <w:r/>
+      <w:r/>
+      <w:r/>
+      <w:r/>
+      <w:r/>
+      <w:r/>
+      <w:r/>
+      <w:r/>
+      <w:r/>
+      <w:r/>
+      <w:r/>
+      <w:r/>
+      <w:r/>
+      <w:r/>
+      <w:r/>
+      <w:r/>
+      <w:r/>
+      <w:r/>
+      <w:r/>
+      <w:r/>
+      <w:r/>
+      <w:r/>
+      <w:r/>
+      <w:r/>
+      <w:r/>
+      <w:r/>
+      <w:r/>
+      <w:r/>
+      <w:r/>
+      <w:r/>
+      <w:r/>
+    </w:p>
+    <w:p>
+      <w:pPr>
+        <w:pStyle w:val="FirstParagraph"/>
+      </w:pPr>
+      <w:r>
+        <w:t>The current public header does not declare printf. The runtime supplies the linked library routines documented by SPEC-SDK-R2 and sdk/include/c48.h.</w:t>
+      </w:r>
+    </w:p>
+    <w:p>
+      <w:pPr>
+        <w:pStyle w:val="BodyText"/>
+      </w:pPr>
+      <w:r>
+        <w:t>Implementation-owned arithmetic helpers are not source-level C48 header declarations. Their names and mechanisms are not part of the portable C48 source contract.</w:t>
       </w:r>
     </w:p>
     <w:p>
@@ -13164,15 +13046,15 @@
         <w:pStyle w:val="Compact"/>
       </w:pPr>
       <w:r>
-        <w:t>local include accepts TXT/C RAW or PACKED logical streams, permits included `&lt;c48.h&gt;`, and rejects a second quoted include level;</w:t>
-      </w:r>
-    </w:p>
-    <w:p>
-      <w:pPr>
-        <w:pStyle w:val="Compact"/>
-      </w:pPr>
-      <w:r>
-        <w:t>RAW and PACKED source with identical logical bytes compile to byte-identical OBJ1.</w:t>
+        <w:t>quoted includes use current host-source logical text and may include the built-in &lt;c48.h&gt; under the strict language include rules; obsolete kernel object-storage tags are not relevant;</w:t>
+      </w:r>
+    </w:p>
+    <w:p>
+      <w:pPr>
+        <w:pStyle w:val="Compact"/>
+      </w:pPr>
+      <w:r>
+        <w:t>Equivalent canonical source bytes must compile to semantically equivalent SSO1/SSX1 results through the current host toolchain; legacy RAW/PACKED ZX-UX object storage is not a host source format.</w:t>
       </w:r>
     </w:p>
     <w:p>
@@ -13212,15 +13094,15 @@
         <w:pStyle w:val="Compact"/>
       </w:pPr>
       <w:r>
-        <w:t>a float parameter is pass-by-value even though its ABI transport is a pointer;</w:t>
-      </w:r>
-    </w:p>
-    <w:p>
-      <w:pPr>
-        <w:pStyle w:val="Compact"/>
-      </w:pPr>
-      <w:r>
-        <w:t>an 8-bit function return ignores H and is zero-extended from L when promoted;</w:t>
+        <w:t>a float parameter remains pass-by-value even when the current ABI passes a pointer to its five-byte value;</w:t>
+      </w:r>
+    </w:p>
+    <w:p>
+      <w:pPr>
+        <w:pStyle w:val="Compact"/>
+      </w:pPr>
+      <w:r>
+        <w:t>an 8-bit function result is returned in HL with H=0 and follows normal C48 promotion rules;</w:t>
       </w:r>
     </w:p>
     <w:p>
@@ -13236,23 +13118,23 @@
         <w:pStyle w:val="Compact"/>
       </w:pPr>
       <w:r>
-        <w:t>successful `cc` is silent, diagnostics use handle 2, and `&gt;` stdout redirection alone does not capture them;</w:t>
-      </w:r>
-    </w:p>
-    <w:p>
-      <w:pPr>
-        <w:pStyle w:val="Compact"/>
-      </w:pPr>
-      <w:r>
-        <w:t>identical logical input produces byte-identical OBJ1 independent of destination path/temp/PID/storage representation.</w:t>
-      </w:r>
-    </w:p>
-    <w:p>
-      <w:pPr>
-        <w:pStyle w:val="Compact"/>
-      </w:pPr>
-      <w:r>
-        <w:t>an empty/all-comment translation unit compiles successfully to the canonical empty OBJ1;</w:t>
+        <w:t>successful rcc returns status 0 and reports compiler failures on stderr;</w:t>
+      </w:r>
+    </w:p>
+    <w:p>
+      <w:pPr>
+        <w:pStyle w:val="Compact"/>
+      </w:pPr>
+      <w:r>
+        <w:t>rebuilding identical input with the same checked sdk/rcc toolchain must produce repeatable SSO1/SSX1 bytes under a controlled environment;</w:t>
+      </w:r>
+    </w:p>
+    <w:p>
+      <w:pPr>
+        <w:pStyle w:val="Compact"/>
+      </w:pPr>
+      <w:r>
+        <w:t>an empty/all-comment translation unit is accepted by the language parser; generating an executable without main is a separate linker failure;</w:t>
       </w:r>
     </w:p>
     <w:p>
@@ -13284,7 +13166,7 @@
         <w:pStyle w:val="Compact"/>
       </w:pPr>
       <w:r>
-        <w:t>diagnostic fixtures prove every exact class spelling/mapping and source-position anchor from Section 80.</w:t>
+        <w:t>diagnostic tests cover current rcc stderr/error status, source positions when provided, and proper rejection of each required invalid C48 construct.</w:t>
       </w:r>
     </w:p>
     <w:p>
@@ -13491,7 +13373,7 @@
         <w:pStyle w:val="BodyText"/>
       </w:pPr>
       <w:r>
-        <w:t>ARG1 and ENV1 are separate read-only process-owned bootstrap allocations. `argv` pointers may refer directly to ARG1 strings for the process lifetime, but portable C48 treats those argument bytes as read-only. Exact `getenv`/environment service behavior requires an independently validated runtime interface and is not redefined by this language specification.</w:t>
+        <w:t>ARG1 and ENV1 are separate read-only process-owned bootstrap allocations. `argv` pointers may refer directly to ARG1 strings for the process lifetime, but portable C48 treats those argument bytes as read-only. Exact getenv/environment behavior is owned by the runtime API steps.</w:t>
       </w:r>
     </w:p>
     <w:p>
@@ -13499,79 +13381,79 @@
         <w:pStyle w:val="Heading1"/>
       </w:pPr>
       <w:r>
-        <w:t>Appendix F. Deterministic `cc` Command-Line Contract</w:t>
-      </w:r>
-    </w:p>
-    <w:p>
-      <w:pPr>
-        <w:pStyle w:val="FirstParagraph"/>
-      </w:pPr>
-      <w:r>
-        <w:t>The only accepted invocation shapes are exactly `cc source` and `cc -o output source`. With one operand it is always the source operand even if its basename begins with `-`; with three operands the first must be exact lower-case `-o`. Any other argument count or option spelling is a usage error with status 1.</w:t>
-      </w:r>
-    </w:p>
-    <w:p>
-      <w:pPr>
-        <w:pStyle w:val="BodyText"/>
-      </w:pPr>
-      <w:r>
-        <w:t>The source operand is resolved as a normal ZX-UX path and MUST resolve to object type C. In default form its final basename must end in exact lower-case `.c`. The default destination is in the same parent directory as the source and is formed by replacing only that final `.c` with `.obj`; the final basename must fit 1..10 portable name bytes and the parent directory must accept OBJ type. Because `.obj` is four bytes, a default-form source stem may contain at most six bytes; a longer legal C source basename requires explicit `-o`.</w:t>
-      </w:r>
-    </w:p>
-    <w:p>
-      <w:pPr>
-        <w:pStyle w:val="BodyText"/>
-      </w:pPr>
-      <w:r>
-        <w:t>In explicit form, the output operand is a normal ZX-UX path. Its final basename is exact/case-sensitive, 1..10 portable name bytes; its destination directory must accept OBJ. The explicit source basename need not end in `.c`, but the resolved input object still MUST have C type.</w:t>
-      </w:r>
-    </w:p>
-    <w:p>
-      <w:pPr>
-        <w:pStyle w:val="BodyText"/>
-      </w:pPr>
-      <w:r>
-        <w:t>The fully normalized input and output paths MUST NOT be identical. `cc` rejects an attempt to replace its source object with OBJ output before creating a temporary.</w:t>
-      </w:r>
-    </w:p>
-    <w:p>
-      <w:pPr>
-        <w:pStyle w:val="BodyText"/>
-      </w:pPr>
-      <w:r>
-        <w:t>For the transaction name, `&lt;pid&gt;` is the decimal current PID and `&lt;n&gt;` is the lowest nonnegative decimal integer whose `/tmp/.cc&lt;pid&gt;.&lt;n&gt;` basename fits the 10-byte namespace and does not already exist. The compiler probes candidates from n=0 upward with O_CREATE|O_EXCL, retries only E_EXIST, and treats any other creation error as terminal. The 32-object mutable-table bound guarantees a free candidate before the 10-byte decimal-name space can be exhausted when the system can create another object.</w:t>
-      </w:r>
-    </w:p>
-    <w:p>
-      <w:pPr>
-        <w:pStyle w:val="BodyText"/>
-      </w:pPr>
-      <w:r>
-        <w:t>On any compile failure after temporary creation, `cc` closes/releases all compiler-owned handles/allocations and removes its temporary before exit. It never removes a pre-existing unrelated stale `.cc...` object. No compiler-owned leak is permitted. The final destination is affected only by the successful validated SYS_RENAME commit.</w:t>
-      </w:r>
-    </w:p>
-    <w:p>
-      <w:pPr>
-        <w:pStyle w:val="BodyText"/>
-      </w:pPr>
-      <w:r>
-        <w:t>Process status is exactly Section 80: 0 on success; 1 for source/usage/compiler errors without a more specific errno; otherwise the terminal direct ZX-UX errno. The compiler reports the first terminal error and does not continue emitting a partially valid object.</w:t>
-      </w:r>
-    </w:p>
-    <w:p>
-      <w:pPr>
-        <w:pStyle w:val="BodyText"/>
-      </w:pPr>
-      <w:r>
-        <w:t>Wrong input object type is reported as E_FORMAT/status 11. Missing input, invalid/overlength paths, creation/rename permission or busy failures, and other namespace/service errors propagate their direct ZX-UX errno when that service is the terminal cause. Pure command-shape/default-suffix validation remains status 1.</w:t>
-      </w:r>
-    </w:p>
-    <w:p>
-      <w:pPr>
-        <w:pStyle w:val="BodyText"/>
-      </w:pPr>
-      <w:r>
-        <w:t>On status 0, `cc` emits no stdout/stderr text and the destination OBJ exists in its committed form. On failure, stdout remains unused by `cc`; the first terminal diagnostic is written to stderr handle 2 under Section 80.</w:t>
+        <w:t>Appendix F. Current rcc command-line and output contract</w:t>
+      </w:r>
+    </w:p>
+    <w:p>
+      <w:pPr>
+        <w:pStyle w:val="FirstParagraph"/>
+      </w:pPr>
+      <w:r>
+        <w:t>Host invocation: sdk/bin/rcc [-S|-c] [-o output] [--bytecode|--native] [--max BYTES] [--stack N] [--heap N] [--udgs N] file.c. One input file is required. -S emits assembly, -c emits an SSO1 object, and the normal link emits SSX1.</w:t>
+      </w:r>
+    </w:p>
+    <w:p>
+      <w:pPr>
+        <w:pStyle w:val="BodyText"/>
+      </w:pPr>
+      <w:r>
+        <w:t>With no -o, the compiler uses the input basename with suffix .s for -S, .sso for -c, or .ssx for an executable. -o selects the exact host output path; an obsolete target OBJ namespace or .obj suffix is not imposed.</w:t>
+      </w:r>
+    </w:p>
+    <w:p>
+      <w:pPr>
+        <w:pStyle w:val="BodyText"/>
+      </w:pPr>
+      <w:r>
+        <w:t>Host path checks apply to source/output names. A program destined for cassette must also use the loader naming rules in SPEC-ELASTIC-R2 Section 6.2; those are program tape names, not host compiler filename limits.</w:t>
+      </w:r>
+    </w:p>
+    <w:p>
+      <w:pPr>
+        <w:pStyle w:val="BodyText"/>
+      </w:pPr>
+      <w:r>
+        <w:t>The compiler must not overwrite its source as output. Output file integrity and failure behavior must be checked in sdk/rcc rather than assuming an old kernel atomic-rename protocol.</w:t>
+      </w:r>
+    </w:p>
+    <w:p>
+      <w:pPr>
+        <w:pStyle w:val="BodyText"/>
+      </w:pPr>
+      <w:r>
+        <w:t>The current host rcc implementation does not use an on-device /tmp/.cc PID transaction or ZX-UX C/OBJ object type codes. Any future atomic-output guarantee requires a checked implementation and regression test.</w:t>
+      </w:r>
+    </w:p>
+    <w:p>
+      <w:pPr>
+        <w:pStyle w:val="BodyText"/>
+      </w:pPr>
+      <w:r>
+        <w:t>Errors return nonzero status and are diagnosed via stderr. In the checked current driver, a C48 or linker error returns 1, command usage returns 2, and an internal assembler error returns 3. Cleanup and output behavior must be tested for each failure route.</w:t>
+      </w:r>
+    </w:p>
+    <w:p>
+      <w:pPr>
+        <w:pStyle w:val="BodyText"/>
+      </w:pPr>
+      <w:r>
+        <w:t>Status 0 signifies that the requested compiler output has been written; it does not establish that an SSX1 program loads within 48K. The latter requires a linker memory check and actual v1 runtime execution.</w:t>
+      </w:r>
+    </w:p>
+    <w:p>
+      <w:pPr>
+        <w:pStyle w:val="BodyText"/>
+      </w:pPr>
+      <w:r>
+        <w:t>Current target format validation is done by sdk/rld for SSO1/SSA1/SSX1 and sdk/rtap for SST1 tapes, with header, bounds, relocation and checksum rules from the current specifications.</w:t>
+      </w:r>
+    </w:p>
+    <w:p>
+      <w:pPr>
+        <w:pStyle w:val="BodyText"/>
+      </w:pPr>
+      <w:r>
+        <w:t>On successful normal compilation the expected output is an SSX1 file. With -c the output is SSO1; with -S it is assembly. No OBJ1, MEX1 or M48O output is permitted from the v1 production toolchain.</w:t>
       </w:r>
     </w:p>
     <w:p>

</xml_diff>

<commit_message>
C48: finish scoped host conformance and amend comment byte rules
Preserve the standalone rcc host architecture decision, 20-row target
integration matrix, and disposition audit of the original 220 clauses.
Add directly mapped C48 executable tests for specification, format,
translation-unit capacity, and comment-only byte acceptance.
Amend Rev 0.11 clauses P0044, P0045 and P0049 to allow arbitrary bytes
inside comments while retaining non-comment source restrictions.
Refresh the canonical DOCX, standalone text and traceability hashes.

Checked new SDK: 1146 C48 PASS, 0 FAIL, 0 ERROR, 759 paragraphs.
C48 scoped compiler gate passed; strict v1 gate still blocks on
110 required clauses plus 2 explicitly undefined items.
22 release unit tests and 356163 private-checker tree checks passed.
This is a C48 conformance milestone, not final ZX-UX v1 release.
</commit_message>
<xml_diff>
--- a/docs/04-C48 Language Specification Rev 0.11.docx
+++ b/docs/04-C48 Language Specification Rev 0.11.docx
@@ -410,7 +410,7 @@
         <w:pStyle w:val="FirstParagraph"/>
       </w:pPr>
       <w:r>
-        <w:t>Canonical C48 source is an 8-bit byte stream using ASCII source characters.</w:t>
+        <w:t>Canonical C48 source is an 8-bit byte stream. Language tokens use ASCII source characters; comment contents may contain any byte value.</w:t>
       </w:r>
     </w:p>
     <w:p>
@@ -437,7 +437,7 @@
         <w:pStyle w:val="FirstParagraph"/>
       </w:pPr>
       <w:r>
-        <w:t>Portable C48 source MUST contain only:</w:t>
+        <w:t>Outside comments, portable C48 source MUST contain only:</w:t>
       </w:r>
     </w:p>
     <w:p>
@@ -474,7 +474,7 @@
         <w:pStyle w:val="FirstParagraph"/>
       </w:pPr>
       <w:r>
-        <w:t>A canonical target-side C source object MUST NOT contain:</w:t>
+        <w:t>Outside comments, a canonical C48 source object MUST NOT contain:</w:t>
       </w:r>
     </w:p>
     <w:p>
@@ -486,33 +486,32 @@
           <w:rStyle w:val="VerbatimChar"/>
         </w:rPr>
         <w:t>CR              0x0D</w:t>
-      </w:r>
-      <w:r>
-        <w:br/>
-      </w:r>
-      <w:r>
-        <w:rPr>
-          <w:rStyle w:val="VerbatimChar"/>
-        </w:rPr>
+        <w:br/>
         <w:t>NUL             0x00</w:t>
-      </w:r>
-      <w:r>
-        <w:br/>
-      </w:r>
-      <w:r>
-        <w:rPr>
-          <w:rStyle w:val="VerbatimChar"/>
-        </w:rPr>
+        <w:br/>
         <w:t>bytes 0x80..0xFF</w:t>
-      </w:r>
-      <w:r>
-        <w:br/>
-      </w:r>
-      <w:r>
-        <w:rPr>
-          <w:rStyle w:val="VerbatimChar"/>
-        </w:rPr>
+        <w:br/>
         <w:t>other ASCII control bytes</w:t>
+        <w:br/>
+        <w:t>These byte values are permitted within comments only.</w:t>
+      </w:r>
+      <w:r/>
+      <w:r>
+        <w:rPr>
+          <w:rStyle w:val="VerbatimChar"/>
+        </w:rPr>
+      </w:r>
+      <w:r/>
+      <w:r>
+        <w:rPr>
+          <w:rStyle w:val="VerbatimChar"/>
+        </w:rPr>
+      </w:r>
+      <w:r/>
+      <w:r>
+        <w:rPr>
+          <w:rStyle w:val="VerbatimChar"/>
+        </w:rPr>
       </w:r>
     </w:p>
     <w:p>
@@ -544,7 +543,7 @@
         <w:pStyle w:val="BodyText"/>
       </w:pPr>
       <w:r>
-        <w:t>UTF-8 multibyte source text is not C48 Version 1.</w:t>
+        <w:t>UTF-8 multibyte sequences and all other byte values are permitted only within /* ... */ and // comments. Outside comments, UTF-8 non-ASCII source characters are not valid C48 Version 1 tokens. Comment bytes are ignored, not interpreted as language tokens.</w:t>
       </w:r>
     </w:p>
     <w:p>

</xml_diff>

<commit_message>
Enhance ZX-UX kernel and ENV1 tests
</commit_message>
<xml_diff>
--- a/docs/04-C48 Language Specification Rev 0.11.docx
+++ b/docs/04-C48 Language Specification Rev 0.11.docx
@@ -9542,7 +9542,7 @@
         <w:pStyle w:val="FirstParagraph"/>
       </w:pPr>
       <w:r>
-        <w:t>A Windows implementation MUST NOT use ordinary IEEE host floating point as its conformance oracle.</w:t>
+        <w:t>A Windows implementation MUST NOT use ordinary IEEE host floating point as its conformance reference.</w:t>
       </w:r>
     </w:p>
     <w:p>
@@ -9558,7 +9558,7 @@
         <w:pStyle w:val="BodyText"/>
       </w:pPr>
       <w:r>
-        <w:t>The canonical 48K ROM services are the executable oracle for parsing, arithmetic, comparison, transcendental operations, formatting, and domain/range behavior. A host emulator or mathematical reimplementation is conforming only after a golden corpus demonstrates equivalence to those services; it may not invent IEEE NaN, infinity, denormal, or rounding behavior.</w:t>
+        <w:t>The canonical 48K ROM services are the executable reference for parsing, arithmetic, comparison, transcendental operations, formatting, and domain/range behavior. A host emulator or mathematical reimplementation is conforming only after a golden corpus demonstrates equivalence to those services; it may not invent IEEE NaN, infinity, denormal, or rounding behavior.</w:t>
       </w:r>
     </w:p>
     <w:p>

</xml_diff>

<commit_message>
build: simplify portable build and move tests outside release
</commit_message>
<xml_diff>
--- a/docs/04-C48 Language Specification Rev 0.11.docx
+++ b/docs/04-C48 Language Specification Rev 0.11.docx
@@ -123,7 +123,7 @@
         <w:pStyle w:val="BodyText"/>
       </w:pPr>
       <w:r>
-        <w:t>Status: ZX-UX v1 language contract; toolchain and binary formats updated for sdk/rcc, sdk/ras, sdk/rld and sdk/rtap. Conformance remains subject to verified tests.</w:t>
+        <w:t>Status: ZX-UX v1 language rule; toolchain and binary formats updated for sdk/rcc, sdk/ras, sdk/rld and sdk/rtap. Conformance remains subject to verified tests.</w:t>
       </w:r>
     </w:p>
     <w:p>
@@ -147,7 +147,7 @@
         <w:pStyle w:val="BodyText"/>
       </w:pPr>
       <w:r>
-        <w:t>Controlling host compiler, runtime library, calling convention and VM contract: docs/SPEC-SDK-R2.md.</w:t>
+        <w:t>Controlling host compiler, runtime library, calling convention and VM rule: docs/SPEC-SDK-R2.md.</w:t>
       </w:r>
     </w:p>
     <w:p>
@@ -265,23 +265,23 @@
         <w:pStyle w:val="FirstParagraph"/>
       </w:pPr>
       <w:r>
-        <w:t>The language sections freeze C48 Rev 0.11 semantics. The target-specific chapters in this ZX-UX v1 edition use the current SDK architecture and file-format contracts.</w:t>
-      </w:r>
-    </w:p>
-    <w:p>
-      <w:pPr>
-        <w:pStyle w:val="BodyText"/>
-      </w:pPr>
-      <w:r>
-        <w:t>For object layouts, ABI, loader services, memory sizes and tape framing, the checked current ZX-UX R2 documents named above control. Historical Rev17/P11 material does not authorize a separate implementation path.</w:t>
-      </w:r>
-    </w:p>
-    <w:p>
-      <w:pPr>
-        <w:pStyle w:val="BodyText"/>
-      </w:pPr>
-      <w:r>
-        <w:t>If a source-language requirement in this document conflicts with an implemented compiler, record and test the discrepancy; the specification governs language semantics. If a toolchain-format statement conflicts with SPEC-SDK-R2 or SPEC-ELASTIC-R2, their current format contracts govern and the discrepancy must be corrected.</w:t>
+        <w:t>The language sections freeze C48 Rev 0.11 semantics. The target-specific chapters in this ZX-UX v1 edition use the current SDK architecture and file-format rules.</w:t>
+      </w:r>
+    </w:p>
+    <w:p>
+      <w:pPr>
+        <w:pStyle w:val="BodyText"/>
+      </w:pPr>
+      <w:r>
+        <w:t>For object layouts, calling convention, loader services, memory sizes and tape framing, the checked current ZX-UX R2 documents named above control. Historical Rev17/P11 material does not authorize a separate implementation path.</w:t>
+      </w:r>
+    </w:p>
+    <w:p>
+      <w:pPr>
+        <w:pStyle w:val="BodyText"/>
+      </w:pPr>
+      <w:r>
+        <w:t>If a source-language requirement in this document conflicts with an implemented compiler, record and test the discrepancy; the specification governs language semantics. If a toolchain-format statement conflicts with SPEC-SDK-R2 or SPEC-ELASTIC-R2, their current format rules govern and the discrepancy must be corrected.</w:t>
       </w:r>
     </w:p>
     <w:p>
@@ -383,7 +383,7 @@
         <w:pStyle w:val="BodyText"/>
       </w:pPr>
       <w:r>
-        <w:t>C48 uses familiar C syntax but defines its own complete Version-1 language contract.</w:t>
+        <w:t>C48 uses familiar C syntax but defines its own complete Version-1 language rule.</w:t>
       </w:r>
     </w:p>
     <w:p>
@@ -2455,7 +2455,7 @@
         <w:pStyle w:val="BodyText"/>
       </w:pPr>
       <w:r>
-        <w:t>String literals have static storage duration. C48 source treats a string literal as nonmodifiable: a direct attempt to assign through the literal expression is rejected where the compiler can identify it, and modifying its bytes through an alias is outside the portable C48 contract. The stock 48K target has no memory protection, so this is a language rule rather than a hardware write-protection promise.</w:t>
+        <w:t>String literals have static storage duration. C48 source treats a string literal as nonmodifiable: a direct attempt to assign through the literal expression is rejected where the compiler can identify it, and modifying its bytes through an alias is outside the portable C48 rule. The stock 48K target has no memory protection, so this is a language rule rather than a hardware write-protection promise.</w:t>
       </w:r>
     </w:p>
     <w:p>
@@ -3791,7 +3791,7 @@
         <w:pStyle w:val="BodyText"/>
       </w:pPr>
       <w:r>
-        <w:t>Two function types match exactly only when return types match exactly and the fixed parameter count and each parameter type match exactly in order. Parameter names are not part of function type. ABI-equivalent widths do not make different source types interchangeable in a prototype/definition pair.</w:t>
+        <w:t>Two function types match exactly only when return types match exactly and the fixed parameter count and each parameter type match exactly in order. Parameter names are not part of function type. calling convention-equivalent widths do not make different source types interchangeable in a prototype/definition pair.</w:t>
       </w:r>
     </w:p>
     <w:p>
@@ -3912,7 +3912,7 @@
         <w:pStyle w:val="BodyText"/>
       </w:pPr>
       <w:r>
-        <w:t>An automatic local object without an initializer has unspecified stored bits. Reading it before the program has assigned a value is outside the portable C48 contract. The native compiler is not required to implement whole-function definite-assignment analysis, although host tooling SHOULD diagnose obvious uses where practical.</w:t>
+        <w:t>An automatic local object without an initializer has unspecified stored bits. Reading it before the program has assigned a value is outside the portable C48 rule. The native compiler is not required to implement whole-function definite-assignment analysis, although host tooling SHOULD diagnose obvious uses where practical.</w:t>
       </w:r>
     </w:p>
     <w:p/>
@@ -4248,7 +4248,7 @@
         <w:pStyle w:val="FirstParagraph"/>
       </w:pPr>
       <w:r>
-        <w:t>A portable dereference must designate live storage large enough for the pointed-to object and must satisfy the pointed-to type's C48 alignment. Thus `short *`, `int *`, `unsigned short *`, `unsigned int *`, and pointer-to-pointer dereferences require an even logical address; `char *`, `unsigned char *`, and `float *` require only byte alignment. Null, one-past, freed, out-of-object, or misaligned dereferences are outside the portable C48 contract.</w:t>
+        <w:t>A portable dereference must designate live storage large enough for the pointed-to object and must satisfy the pointed-to type's C48 alignment. Thus `short *`, `int *`, `unsigned short *`, `unsigned int *`, and pointer-to-pointer dereferences require an even logical address; `char *`, `unsigned char *`, and `float *` require only byte alignment. Null, one-past, freed, out-of-object, or misaligned dereferences are outside the portable C48 rule.</w:t>
       </w:r>
     </w:p>
     <w:p>
@@ -4612,7 +4612,7 @@
         <w:pStyle w:val="BodyText"/>
       </w:pPr>
       <w:r>
-        <w:t>For the argument form, the validated ARG1 contract gives `argc` in 1..16. `argv` points to an `argc+1` pointer vector constructed by crt0, `argv[0]` is the exact invocation token, and `argv[argc]` is the null pointer.</w:t>
+        <w:t>For the argument form, the validated ARG1 rule gives `argc` in 1..16. `argv` points to an `argc+1` pointer vector constructed by crt0, `argv[0]` is the exact invocation token, and `argv[argc]` is the null pointer.</w:t>
       </w:r>
     </w:p>
     <w:p>
@@ -5836,7 +5836,7 @@
       <w:bookmarkStart w:id="42" w:name="integer-promotions"/>
       <w:bookmarkEnd w:id="41"/>
       <w:r>
-        <w:t>An lvalue designates a C48 object. A modifiable lvalue is an lvalue whose object is writable under the language contract.</w:t>
+        <w:t>An lvalue designates a C48 object. A modifiable lvalue is an lvalue whose object is writable under the language rule.</w:t>
       </w:r>
     </w:p>
     <w:p>
@@ -5860,7 +5860,7 @@
         <w:pStyle w:val="BodyText"/>
       </w:pPr>
       <w:r>
-        <w:t>Dereferencing a null pointer, one-past pointer, pointer outside the live object, or otherwise invalid pointer is outside the portable C48 contract. The 48K machine has no memory protection; strict host execution SHOULD trap such invalid logical-pointer accesses where it can prove them.</w:t>
+        <w:t>Dereferencing a null pointer, one-past pointer, pointer outside the live object, or otherwise invalid pointer is outside the portable C48 rule. The 48K machine has no memory protection; strict host execution SHOULD trap such invalid logical-pointer accesses where it can prove them.</w:t>
       </w:r>
     </w:p>
     <w:p/>
@@ -6547,7 +6547,7 @@
         <w:pStyle w:val="BodyText"/>
       </w:pPr>
       <w:r>
-        <w:t>Ordering unrelated pointers is outside the portable C48 contract.</w:t>
+        <w:t>Ordering unrelated pointers is outside the portable C48 rule.</w:t>
       </w:r>
     </w:p>
     <w:p>
@@ -6616,7 +6616,7 @@
         <w:pStyle w:val="BodyText"/>
       </w:pPr>
       <w:r>
-        <w:t>Ordering or subtracting unrelated pointers is outside the portable C48 contract. Pointer arithmetic may produce the conventional one-past pointer for the same object, but that pointer MUST NOT be dereferenced.</w:t>
+        <w:t>Ordering or subtracting unrelated pointers is outside the portable C48 rule. Pointer arithmetic may produce the conventional one-past pointer for the same object, but that pointer MUST NOT be dereferenced.</w:t>
       </w:r>
     </w:p>
     <w:p>
@@ -6632,7 +6632,7 @@
         <w:pStyle w:val="BodyText"/>
       </w:pPr>
       <w:r>
-        <w:t>Pointer subtraction computes the mathematical element-index difference, reduces it modulo 65536, and returns those low 16 bits interpreted as C48 signed `int`. This wrap is part of the C48 language contract for same-object compatible pointers, not undefined behavior.</w:t>
+        <w:t>Pointer subtraction computes the mathematical element-index difference, reduces it modulo 65536, and returns those low 16 bits interpreted as C48 signed `int`. This wrap is part of the C48 language rule for same-object compatible pointers, not undefined behavior.</w:t>
       </w:r>
     </w:p>
     <w:p/>
@@ -6798,7 +6798,7 @@
         <w:pStyle w:val="BodyText"/>
       </w:pPr>
       <w:r>
-        <w:t>Increment/decrement of `void *`, an invalid pointer, a string literal, an array, or a non-lvalue is rejected or outside the portable pointer-access contract as applicable.</w:t>
+        <w:t>Increment/decrement of `void *`, an invalid pointer, a string literal, an array, or a non-lvalue is rejected or outside the portable pointer-access rule as applicable.</w:t>
       </w:r>
     </w:p>
     <w:p/>
@@ -6849,7 +6849,7 @@
         <w:pStyle w:val="BodyText"/>
       </w:pPr>
       <w:r>
-        <w:t>When an error occurs in a compiler-generated language numeric operation or cast that has no C-level error-return channel -- including float arithmetic, float comparison, integer-to-float conversion, or float-to-integer conversion -- the standard C48 runtime terminates the process with status 1. Public library functions that explicitly return a ZX-UX error value, such as `beep`, retain their documented error-return contract instead of being converted into this language trap.</w:t>
+        <w:t>When an error occurs in a compiler-generated language numeric operation or cast that has no C-level error-return channel -- including float arithmetic, float comparison, integer-to-float conversion, or float-to-integer conversion -- the standard C48 runtime terminates the process with status 1. Public library functions that explicitly return a ZX-UX error value, such as `beep`, retain their documented error-return rule instead of being converted into this language trap.</w:t>
       </w:r>
     </w:p>
     <w:p>
@@ -6977,7 +6977,7 @@
         <w:pStyle w:val="BodyText"/>
       </w:pPr>
       <w:r>
-        <w:t>Function arguments are evaluated and captured left-to-right. The current rcc ABI pushes all but the last argument in that order and passes the final argument in HL; physical stack placement does not change source evaluation order.</w:t>
+        <w:t>Function arguments are evaluated and captured left-to-right. The current rcc calling convention pushes all but the last argument in that order and passes the final argument in HL; physical stack placement does not change source evaluation order.</w:t>
       </w:r>
     </w:p>
     <w:p>
@@ -7044,7 +7044,7 @@
         <w:pStyle w:val="BodyText"/>
       </w:pPr>
       <w:r>
-        <w:t>Float parameters retain C48 pass-by-value semantics. The ZX-UX rcc ABI transports a float argument through a pointer to its five-byte value; generated code MUST preserve callee-local parameter assignment and must not mutate a caller object except through an explicitly passed pointer.</w:t>
+        <w:t>Float parameters retain C48 pass-by-value semantics. The ZX-UX rcc calling convention transports a float argument through a pointer to its five-byte value; generated code MUST preserve callee-local parameter assignment and must not mutate a caller object except through an explicitly passed pointer.</w:t>
       </w:r>
     </w:p>
     <w:p>
@@ -7080,7 +7080,7 @@
         <w:rPr>
           <w:rStyle w:val="VerbatimChar"/>
         </w:rPr>
-        <w:t>ZX-UX rcc ABI (not the historical C48_REGCALL convention)</w:t>
+        <w:t>ZX-UX rcc calling convention (not the historical C48_REGCALL convention)</w:t>
       </w:r>
     </w:p>
     <w:p>
@@ -7157,7 +7157,7 @@
         <w:pStyle w:val="BodyText"/>
       </w:pPr>
       <w:r>
-        <w:t>The current native/SSB1 interoperation uses the same rcc ABI; the SSB1 dispatch and frame rules are defined by SPEC-SDK-R2 Section 6.</w:t>
+        <w:t>The current native/SSB1 interoperation uses the same rcc calling convention; the SSB1 dispatch and frame rules are defined by SPEC-SDK-R2 Section 6.</w:t>
       </w:r>
       <w:r>
         <w:rPr>
@@ -7187,18 +7187,18 @@
       <w:pPr>
         <w:pStyle w:val="Heading1"/>
       </w:pPr>
-      <w:bookmarkStart w:id="59" w:name="function-return-abi"/>
+      <w:bookmarkStart w:id="59" w:name="function-return-calling-rules"/>
       <w:bookmarkEnd w:id="58"/>
       <w:r>
-        <w:t>58. ZX-UX rcc return ABI</w:t>
-      </w:r>
-    </w:p>
-    <w:p>
-      <w:pPr>
-        <w:pStyle w:val="FirstParagraph"/>
-      </w:pPr>
-      <w:r>
-        <w:t>The current SDK returns ordinary scalar and pointer values in HL, with H=0 for an 8-bit result. Floating-point results are stored in the runtime @fac value area under the current SDK contract.</w:t>
+        <w:t>58. ZX-UX rcc return calling convention</w:t>
+      </w:r>
+    </w:p>
+    <w:p>
+      <w:pPr>
+        <w:pStyle w:val="FirstParagraph"/>
+      </w:pPr>
+      <w:r>
+        <w:t>The current SDK returns ordinary scalar and pointer values in HL, with H=0 for an 8-bit result. Floating-point results are stored in the runtime @fac value area under the current SDK rule.</w:t>
       </w:r>
     </w:p>
     <w:p>
@@ -7235,7 +7235,7 @@
         <w:pStyle w:val="FirstParagraph"/>
       </w:pPr>
       <w:r>
-        <w:t>The current rcc float-return ABI uses the runtime five-byte @fac area, not a hidden first result-pointer argument.</w:t>
+        <w:t>The current rcc float-return calling convention uses the runtime five-byte @fac area, not a hidden first result-pointer argument.</w:t>
       </w:r>
       <w:r>
         <w:rPr>
@@ -7288,7 +7288,7 @@
         <w:pStyle w:val="BodyText"/>
       </w:pPr>
       <w:r>
-        <w:t>An 8-bit char/unsigned char return uses HL with H=0 in the current ABI, allowing normal unsigned promotion. Generated callers must still implement the C48 source type and conversion rules.</w:t>
+        <w:t>An 8-bit char/unsigned char return uses HL with H=0 in the current calling convention, allowing normal unsigned promotion. Generated callers must still implement the C48 source type and conversion rules.</w:t>
       </w:r>
     </w:p>
     <w:p/>
@@ -9116,7 +9116,7 @@
       <w:bookmarkStart w:id="79" w:name="compiler-architecture-invariants"/>
       <w:bookmarkEnd w:id="78"/>
       <w:r>
-        <w:t>The C48 grammar has no arbitrary three- or six-argument limit. Under the current rcc ABI, each argument except the last occupies a stack word, and the final argument is passed in HL. Actual memory limits are enforced by current linker/runtime contracts.</w:t>
+        <w:t>The C48 grammar has no arbitrary three- or six-argument limit. Under the current rcc calling convention, each argument except the last occupies a stack word, and the final argument is passed in HL. Actual memory limits are enforced by current linker/runtime rules.</w:t>
       </w:r>
     </w:p>
     <w:p>
@@ -9307,7 +9307,7 @@
         <w:pStyle w:val="BodyText"/>
       </w:pPr>
       <w:r>
-        <w:t>Diagnostic reason wording and class prefixes from the historical resident cc compiler are not the current rcc command ABI. Source-language conformance still requires distinctions among lexical, preprocessing, syntax, type, declaration, literal, constant-expression and resource failures where relevant.</w:t>
+        <w:t>Diagnostic reason wording and class prefixes from the historical resident cc compiler are not the current rcc command calling convention. Source-language conformance still requires distinctions among lexical, preprocessing, syntax, type, declaration, literal, constant-expression and resource failures where relevant.</w:t>
       </w:r>
     </w:p>
     <w:p>
@@ -9339,7 +9339,7 @@
         <w:pStyle w:val="BodyText"/>
       </w:pPr>
       <w:r>
-        <w:t>Error source coordinates, when supplied, are source-line positions; tests must establish any claimed exact byte-column contract for the current lexer. Historical native-cc position rules are not silently inherited.</w:t>
+        <w:t>Error source coordinates, when supplied, are source-line positions; tests must establish any claimed exact byte-column rule for the current lexer. Historical native-cc position rules are not silently inherited.</w:t>
       </w:r>
     </w:p>
     <w:p>
@@ -9431,10 +9431,10 @@
       <w:pPr>
         <w:pStyle w:val="Heading1"/>
       </w:pPr>
-      <w:bookmarkStart w:id="83" w:name="host-side-c48-development-contract"/>
+      <w:bookmarkStart w:id="83" w:name="host-side-c48-development-rules"/>
       <w:bookmarkEnd w:id="82"/>
       <w:r>
-        <w:t>82. Host-side C48 development contract</w:t>
+        <w:t>82. Host-side C48 development rule</w:t>
       </w:r>
     </w:p>
     <w:p>
@@ -9460,7 +9460,7 @@
         <w:pStyle w:val="BodyText"/>
       </w:pPr>
       <w:r>
-        <w:t>It MUST reproduce `sizeof` and alignment independent of the host ABI and must treat source `-32768` according to the C48 literal rules rather than host C intuition.</w:t>
+        <w:t>It MUST reproduce `sizeof` and alignment independent of the host calling convention and must treat source `-32768` according to the C48 literal rules rather than host C intuition.</w:t>
       </w:r>
     </w:p>
     <w:p>
@@ -10986,7 +10986,7 @@
         <w:pStyle w:val="BodyText"/>
       </w:pPr>
       <w:r>
-        <w:t>SPEC-SDK-R2 and SPEC-ELASTIC-R2 own the current compiler ABI, object/executable/tape formats and 48K resource limits.</w:t>
+        <w:t>SPEC-SDK-R2 and SPEC-ELASTIC-R2 own the current compiler calling convention, object/executable/tape formats and 48K resource limits.</w:t>
       </w:r>
     </w:p>
     <w:p>
@@ -11031,7 +11031,7 @@
       <w:bookmarkStart w:id="98" w:name="important-const-distinction"/>
       <w:bookmarkEnd w:id="97"/>
       <w:r>
-        <w:t>This document owns source tokens, grammar, preprocessing semantics, types, conversions, expressions and statements. The current SDK and kernel documents own runtime, API and binary ABI implementation details.</w:t>
+        <w:t>This document owns source tokens, grammar, preprocessing semantics, types, conversions, expressions and statements. The current SDK and kernel documents own runtime, API and binary calling convention implementation details.</w:t>
       </w:r>
     </w:p>
     <w:p>
@@ -11188,7 +11188,7 @@
         <w:pStyle w:val="FirstParagraph"/>
       </w:pPr>
       <w:r>
-        <w:t>the developer MUST stop that portion of implementation and record the unresolved contract.</w:t>
+        <w:t>the developer MUST stop that portion of implementation and record the unresolved rule.</w:t>
       </w:r>
     </w:p>
     <w:p>
@@ -11495,7 +11495,7 @@
         <w:pStyle w:val="Compact"/>
       </w:pPr>
       <w:r>
-        <w:t>prototypes, function definitions, parameter pass-by-value behavior, main/argc/argv, and ABI-visible returns;</w:t>
+        <w:t>prototypes, function definitions, parameter pass-by-value behavior, main/argc/argv, and calling convention-visible returns;</w:t>
       </w:r>
     </w:p>
     <w:p>
@@ -11583,7 +11583,7 @@
         <w:pStyle w:val="FirstParagraph"/>
       </w:pPr>
       <w:r>
-        <w:t>No language rule may be left to unchecked implementation inference. Target ABI choices follow the current checked architecture, not retired native-compiler implementation plans.</w:t>
+        <w:t>No language rule may be left to unchecked implementation inference. Target calling convention choices follow the current checked architecture, not retired native-compiler implementation plans.</w:t>
       </w:r>
     </w:p>
     <w:p/>
@@ -12103,7 +12103,7 @@
         <w:pStyle w:val="BodyText"/>
       </w:pPr>
       <w:r>
-        <w:t>The same language contract applies to:</w:t>
+        <w:t>The same language rule applies to:</w:t>
       </w:r>
     </w:p>
     <w:p>
@@ -12141,15 +12141,15 @@
         <w:pStyle w:val="FirstParagraph"/>
       </w:pPr>
       <w:r>
-        <w:t>shall target the same language contract.</w:t>
-      </w:r>
-    </w:p>
-    <w:p>
-      <w:pPr>
-        <w:pStyle w:val="BodyText"/>
-      </w:pPr>
-      <w:r>
-        <w:t>That common contract, rather than either compiler's incidental behavior, is the controlling reference for source portability.</w:t>
+        <w:t>shall target the same language rule.</w:t>
+      </w:r>
+    </w:p>
+    <w:p>
+      <w:pPr>
+        <w:pStyle w:val="BodyText"/>
+      </w:pPr>
+      <w:r>
+        <w:t>That common rule, rather than either compiler's incidental behavior, is the controlling reference for source portability.</w:t>
       </w:r>
     </w:p>
     <w:bookmarkEnd w:id="104"/>
@@ -12957,7 +12957,7 @@
         <w:pStyle w:val="BodyText"/>
       </w:pPr>
       <w:r>
-        <w:t>Implementation-owned arithmetic helpers are not source-level C48 header declarations. Their names and mechanisms are not part of the portable C48 source contract.</w:t>
+        <w:t>Implementation-owned arithmetic helpers are not source-level C48 header declarations. Their names and mechanisms are not part of the portable C48 source rule.</w:t>
       </w:r>
     </w:p>
     <w:p>
@@ -13093,7 +13093,7 @@
         <w:pStyle w:val="Compact"/>
       </w:pPr>
       <w:r>
-        <w:t>a float parameter remains pass-by-value even when the current ABI passes a pointer to its five-byte value;</w:t>
+        <w:t>a float parameter remains pass-by-value even when the current calling convention passes a pointer to its five-byte value;</w:t>
       </w:r>
     </w:p>
     <w:p>
@@ -13356,7 +13356,7 @@
         <w:pStyle w:val="BodyText"/>
       </w:pPr>
       <w:r>
-        <w:t>All parameters are source-language values. Integer and pointer values are copied into the callee parameter abstraction. Float arguments are also values despite pointer-backed ABI transport; assigning to a float parameter cannot mutate the caller's source float.</w:t>
+        <w:t>All parameters are source-language values. Integer and pointer values are copied into the callee parameter abstraction. Float arguments are also values despite pointer-backed calling convention transport; assigning to a float parameter cannot mutate the caller's source float.</w:t>
       </w:r>
     </w:p>
     <w:p>
@@ -13380,7 +13380,7 @@
         <w:pStyle w:val="Heading1"/>
       </w:pPr>
       <w:r>
-        <w:t>Appendix F. Current rcc command-line and output contract</w:t>
+        <w:t>Appendix F. Current rcc command-line and output rule</w:t>
       </w:r>
     </w:p>
     <w:p>

</xml_diff>